<commit_message>
sửa lại file word BT02
</commit_message>
<xml_diff>
--- a/Tuan02/BT02_DataUnderstanding_BuiDucTruong_3123411319.docx
+++ b/Tuan02/BT02_DataUnderstanding_BuiDucTruong_3123411319.docx
@@ -425,17 +425,9 @@
           <w:lang w:val="vi-VN"/>
         </w:rPr>
         <w:drawing>
-          <wp:anchor distT="0" distB="0" distL="114300" distR="114300" simplePos="0" relativeHeight="251658240" behindDoc="0" locked="0" layoutInCell="1" allowOverlap="1" wp14:anchorId="596B5C49" wp14:editId="5909086F">
-            <wp:simplePos x="914400" y="1236133"/>
-            <wp:positionH relativeFrom="column">
-              <wp:align>left</wp:align>
-            </wp:positionH>
-            <wp:positionV relativeFrom="paragraph">
-              <wp:align>top</wp:align>
-            </wp:positionV>
+          <wp:inline distT="0" distB="0" distL="0" distR="0" wp14:anchorId="596B5C49" wp14:editId="2A3A0E7A">
             <wp:extent cx="4680857" cy="3931920"/>
             <wp:effectExtent l="0" t="0" r="5715" b="0"/>
-            <wp:wrapSquare wrapText="bothSides"/>
             <wp:docPr id="173400009" name="Picture 1"/>
             <wp:cNvGraphicFramePr>
               <a:graphicFrameLocks xmlns:a="http://schemas.openxmlformats.org/drawingml/2006/main" noChangeAspect="1"/>
@@ -471,7 +463,7 @@
                 </pic:pic>
               </a:graphicData>
             </a:graphic>
-          </wp:anchor>
+          </wp:inline>
         </w:drawing>
       </w:r>
       <w:r>
@@ -483,18 +475,6 @@
         </w:rPr>
         <w:br w:type="textWrapping" w:clear="all"/>
       </w:r>
-    </w:p>
-    <w:p>
-      <w:pPr>
-        <w:pStyle w:val="Heading2"/>
-        <w:spacing w:line="26" w:lineRule="atLeast"/>
-        <w:jc w:val="both"/>
-        <w:rPr>
-          <w:rFonts w:ascii="Times New Roman" w:hAnsi="Times New Roman" w:cs="Times New Roman"/>
-          <w:color w:val="auto"/>
-          <w:lang w:val="vi-VN"/>
-        </w:rPr>
-      </w:pPr>
     </w:p>
     <w:p>
       <w:pPr>
@@ -936,31 +916,15 @@
         </w:rPr>
         <w:t xml:space="preserve"> </w:t>
       </w:r>
-      <m:oMath>
-        <m:d>
-          <m:dPr>
-            <m:begChr m:val="{"/>
-            <m:endChr m:val="}"/>
-            <m:ctrlPr>
-              <w:rPr>
-                <w:rFonts w:ascii="Cambria Math" w:hAnsi="Cambria Math" w:cs="Times New Roman"/>
-                <w:sz w:val="26"/>
-                <w:szCs w:val="26"/>
-              </w:rPr>
-            </m:ctrlPr>
-          </m:dPr>
-          <m:e>
-            <m:r>
-              <w:rPr>
-                <w:rFonts w:ascii="Cambria Math" w:hAnsi="Cambria Math" w:cs="Times New Roman"/>
-                <w:sz w:val="26"/>
-                <w:szCs w:val="26"/>
-              </w:rPr>
-              <m:t>-2000,5000,7000,7800,8000,8200,8500,15000,30000</m:t>
-            </m:r>
-          </m:e>
-        </m:d>
-      </m:oMath>
+      <w:r>
+        <w:rPr>
+          <w:rFonts w:ascii="Times New Roman" w:hAnsi="Times New Roman" w:cs="Times New Roman"/>
+          <w:sz w:val="26"/>
+          <w:szCs w:val="26"/>
+          <w:lang w:val="vi-VN"/>
+        </w:rPr>
+        <w:t>{-2000,5000,7000,7800,8000,8200,8500,15000,30000}</w:t>
+      </w:r>
     </w:p>
     <w:p>
       <w:pPr>
@@ -1047,7 +1011,6 @@
           <w:szCs w:val="26"/>
           <w:lang w:val="vi-VN"/>
         </w:rPr>
-        <w:lastRenderedPageBreak/>
         <w:t>Median</w:t>
       </w:r>
       <w:r>
@@ -1083,6 +1046,7 @@
           <w:szCs w:val="26"/>
           <w:lang w:val="vi-VN"/>
         </w:rPr>
+        <w:lastRenderedPageBreak/>
         <w:t xml:space="preserve">Mode = Không có </w:t>
       </w:r>
     </w:p>
@@ -1106,31 +1070,15 @@
         </w:rPr>
         <w:t xml:space="preserve">Điểm: Tập hợp </w:t>
       </w:r>
-      <m:oMath>
-        <m:d>
-          <m:dPr>
-            <m:begChr m:val="{"/>
-            <m:endChr m:val="}"/>
-            <m:ctrlPr>
-              <w:rPr>
-                <w:rFonts w:ascii="Cambria Math" w:hAnsi="Cambria Math" w:cs="Times New Roman"/>
-                <w:sz w:val="26"/>
-                <w:szCs w:val="26"/>
-              </w:rPr>
-            </m:ctrlPr>
-          </m:dPr>
-          <m:e>
-            <m:r>
-              <w:rPr>
-                <w:rFonts w:ascii="Cambria Math" w:hAnsi="Cambria Math" w:cs="Times New Roman"/>
-                <w:sz w:val="26"/>
-                <w:szCs w:val="26"/>
-              </w:rPr>
-              <m:t>6.0, 6.5, 7.0, 7.5, 7.8, 8.0, 8.5, 9.0, 9.5</m:t>
-            </m:r>
-          </m:e>
-        </m:d>
-      </m:oMath>
+      <w:r>
+        <w:rPr>
+          <w:rFonts w:ascii="Times New Roman" w:hAnsi="Times New Roman" w:cs="Times New Roman"/>
+          <w:sz w:val="26"/>
+          <w:szCs w:val="26"/>
+          <w:lang w:val="vi-VN"/>
+        </w:rPr>
+        <w:t>{6.0,6.5,7.0,7.5,7.8,8.0,8.5,9.0,9.5}</w:t>
+      </w:r>
     </w:p>
     <w:p>
       <w:pPr>
@@ -2563,31 +2511,29 @@
           <w:lang w:val="vi-VN"/>
         </w:rPr>
       </w:pPr>
+      <w:r>
+        <w:rPr>
+          <w:rFonts w:ascii="Times New Roman" w:eastAsiaTheme="minorEastAsia" w:hAnsi="Times New Roman" w:cs="Times New Roman"/>
+          <w:sz w:val="26"/>
+          <w:szCs w:val="26"/>
+          <w:lang w:val="vi-VN"/>
+        </w:rPr>
+        <w:t>{-2000,5000,7000,7800,8000,8200,8500,15000,30000}</w:t>
+      </w:r>
+    </w:p>
+    <w:p>
+      <w:pPr>
+        <w:spacing w:line="26" w:lineRule="atLeast"/>
+        <w:jc w:val="both"/>
+        <w:rPr>
+          <w:rFonts w:ascii="Times New Roman" w:eastAsiaTheme="minorEastAsia" w:hAnsi="Times New Roman" w:cs="Times New Roman"/>
+          <w:sz w:val="26"/>
+          <w:szCs w:val="26"/>
+          <w:lang w:val="vi-VN"/>
+        </w:rPr>
+      </w:pPr>
       <m:oMathPara>
         <m:oMath>
-          <m:d>
-            <m:dPr>
-              <m:begChr m:val="{"/>
-              <m:endChr m:val="}"/>
-              <m:ctrlPr>
-                <w:rPr>
-                  <w:rFonts w:ascii="Cambria Math" w:hAnsi="Cambria Math" w:cs="Times New Roman"/>
-                  <w:sz w:val="26"/>
-                  <w:szCs w:val="26"/>
-                </w:rPr>
-              </m:ctrlPr>
-            </m:dPr>
-            <m:e>
-              <m:r>
-                <w:rPr>
-                  <w:rFonts w:ascii="Cambria Math" w:hAnsi="Cambria Math" w:cs="Times New Roman"/>
-                  <w:sz w:val="26"/>
-                  <w:szCs w:val="26"/>
-                </w:rPr>
-                <m:t>-2000,5000,7000,7800,8000,8200,8500,15000,30000</m:t>
-              </m:r>
-            </m:e>
-          </m:d>
           <m:r>
             <m:rPr>
               <m:sty m:val="p"/>
@@ -2740,33 +2686,26 @@
           <w:szCs w:val="26"/>
           <w:lang w:val="vi-VN"/>
         </w:rPr>
-        <w:t xml:space="preserve">+ Nửa dưới: </w:t>
-      </w:r>
-      <m:oMath>
-        <m:d>
-          <m:dPr>
-            <m:begChr m:val="{"/>
-            <m:endChr m:val="}"/>
-            <m:ctrlPr>
-              <w:rPr>
-                <w:rFonts w:ascii="Cambria Math" w:eastAsiaTheme="minorEastAsia" w:hAnsi="Cambria Math" w:cs="Times New Roman"/>
-                <w:sz w:val="26"/>
-                <w:szCs w:val="26"/>
-              </w:rPr>
-            </m:ctrlPr>
-          </m:dPr>
-          <m:e>
-            <m:r>
-              <w:rPr>
-                <w:rFonts w:ascii="Cambria Math" w:eastAsiaTheme="minorEastAsia" w:hAnsi="Cambria Math" w:cs="Times New Roman"/>
-                <w:sz w:val="26"/>
-                <w:szCs w:val="26"/>
-              </w:rPr>
-              <m:t>-2000,5000,7000,7800</m:t>
-            </m:r>
-          </m:e>
-        </m:d>
-      </m:oMath>
+        <w:t>+ Nửa dưới:</w:t>
+      </w:r>
+      <w:r>
+        <w:rPr>
+          <w:rFonts w:ascii="Times New Roman" w:eastAsiaTheme="minorEastAsia" w:hAnsi="Times New Roman" w:cs="Times New Roman"/>
+          <w:sz w:val="26"/>
+          <w:szCs w:val="26"/>
+          <w:lang w:val="vi-VN"/>
+        </w:rPr>
+        <w:t xml:space="preserve"> </w:t>
+      </w:r>
+      <w:r>
+        <w:rPr>
+          <w:rFonts w:ascii="Times New Roman" w:eastAsiaTheme="minorEastAsia" w:hAnsi="Times New Roman" w:cs="Times New Roman"/>
+          <w:sz w:val="26"/>
+          <w:szCs w:val="26"/>
+          <w:lang w:val="vi-VN"/>
+        </w:rPr>
+        <w:t>{-2000,5000,7000,7800}</w:t>
+      </w:r>
     </w:p>
     <w:p>
       <w:pPr>
@@ -2777,6 +2716,7 @@
           <w:rFonts w:ascii="Times New Roman" w:eastAsiaTheme="minorEastAsia" w:hAnsi="Times New Roman" w:cs="Times New Roman"/>
           <w:sz w:val="26"/>
           <w:szCs w:val="26"/>
+          <w:lang w:val="vi-VN"/>
         </w:rPr>
       </w:pPr>
       <w:r>
@@ -2794,33 +2734,34 @@
           <w:sz w:val="26"/>
           <w:szCs w:val="26"/>
         </w:rPr>
-        <w:t xml:space="preserve">Nửa trên: </w:t>
-      </w:r>
-      <m:oMath>
-        <m:d>
-          <m:dPr>
-            <m:begChr m:val="{"/>
-            <m:endChr m:val="}"/>
-            <m:ctrlPr>
-              <w:rPr>
-                <w:rFonts w:ascii="Cambria Math" w:eastAsiaTheme="minorEastAsia" w:hAnsi="Cambria Math" w:cs="Times New Roman"/>
-                <w:sz w:val="26"/>
-                <w:szCs w:val="26"/>
-              </w:rPr>
-            </m:ctrlPr>
-          </m:dPr>
-          <m:e>
-            <m:r>
-              <w:rPr>
-                <w:rFonts w:ascii="Cambria Math" w:eastAsiaTheme="minorEastAsia" w:hAnsi="Cambria Math" w:cs="Times New Roman"/>
-                <w:sz w:val="26"/>
-                <w:szCs w:val="26"/>
-              </w:rPr>
-              <m:t>8200,8500,15000,30000</m:t>
-            </m:r>
-          </m:e>
-        </m:d>
-      </m:oMath>
+        <w:t xml:space="preserve">Nửa </w:t>
+      </w:r>
+      <w:r>
+        <w:rPr>
+          <w:rFonts w:ascii="Times New Roman" w:eastAsiaTheme="minorEastAsia" w:hAnsi="Times New Roman" w:cs="Times New Roman"/>
+          <w:sz w:val="26"/>
+          <w:szCs w:val="26"/>
+        </w:rPr>
+        <w:t>trên</w:t>
+      </w:r>
+      <w:r>
+        <w:rPr>
+          <w:rFonts w:ascii="Times New Roman" w:eastAsiaTheme="minorEastAsia" w:hAnsi="Times New Roman" w:cs="Times New Roman"/>
+          <w:sz w:val="26"/>
+          <w:szCs w:val="26"/>
+          <w:lang w:val="vi-VN"/>
+        </w:rPr>
+        <w:t xml:space="preserve">: </w:t>
+      </w:r>
+      <w:r>
+        <w:rPr>
+          <w:rFonts w:ascii="Times New Roman" w:eastAsiaTheme="minorEastAsia" w:hAnsi="Times New Roman" w:cs="Times New Roman"/>
+          <w:sz w:val="26"/>
+          <w:szCs w:val="26"/>
+          <w:lang w:val="vi-VN"/>
+        </w:rPr>
+        <w:t>{8200,8500,15000,30000}</w:t>
+      </w:r>
     </w:p>
     <w:p>
       <w:pPr>
@@ -2866,62 +2807,30 @@
           <w:szCs w:val="26"/>
           <w:lang w:val="vi-VN"/>
         </w:rPr>
+        <w:lastRenderedPageBreak/>
         <w:t>Q1 (trung vị nửa dưới): Nằm giữa 5000 và 7000:</w:t>
       </w:r>
     </w:p>
     <w:p>
       <w:pPr>
         <w:spacing w:line="26" w:lineRule="atLeast"/>
-        <w:jc w:val="both"/>
-        <w:rPr>
-          <w:rFonts w:ascii="Times New Roman" w:eastAsiaTheme="minorEastAsia" w:hAnsi="Times New Roman" w:cs="Times New Roman"/>
-          <w:sz w:val="26"/>
-          <w:szCs w:val="26"/>
-          <w:lang w:val="vi-VN"/>
-        </w:rPr>
-      </w:pPr>
-      <m:oMathPara>
-        <m:oMath>
-          <m:r>
-            <w:rPr>
-              <w:rFonts w:ascii="Cambria Math" w:eastAsiaTheme="minorEastAsia" w:hAnsi="Cambria Math" w:cs="Times New Roman"/>
-              <w:sz w:val="26"/>
-              <w:szCs w:val="26"/>
-            </w:rPr>
-            <w:lastRenderedPageBreak/>
-            <m:t>Q1=</m:t>
-          </m:r>
-          <m:d>
-            <m:dPr>
-              <m:ctrlPr>
-                <w:rPr>
-                  <w:rFonts w:ascii="Cambria Math" w:eastAsiaTheme="minorEastAsia" w:hAnsi="Cambria Math" w:cs="Times New Roman"/>
-                  <w:sz w:val="26"/>
-                  <w:szCs w:val="26"/>
-                </w:rPr>
-              </m:ctrlPr>
-            </m:dPr>
-            <m:e>
-              <m:r>
-                <w:rPr>
-                  <w:rFonts w:ascii="Cambria Math" w:eastAsiaTheme="minorEastAsia" w:hAnsi="Cambria Math" w:cs="Times New Roman"/>
-                  <w:sz w:val="26"/>
-                  <w:szCs w:val="26"/>
-                </w:rPr>
-                <m:t>5000+7000</m:t>
-              </m:r>
-            </m:e>
-          </m:d>
-          <m:r>
-            <w:rPr>
-              <w:rFonts w:ascii="Cambria Math" w:eastAsiaTheme="minorEastAsia" w:hAnsi="Cambria Math" w:cs="Times New Roman"/>
-              <w:sz w:val="26"/>
-              <w:szCs w:val="26"/>
-            </w:rPr>
-            <m:t>/2=6000</m:t>
-          </m:r>
-        </m:oMath>
-      </m:oMathPara>
+        <w:jc w:val="center"/>
+        <w:rPr>
+          <w:rFonts w:ascii="Times New Roman" w:eastAsiaTheme="minorEastAsia" w:hAnsi="Times New Roman" w:cs="Times New Roman"/>
+          <w:sz w:val="26"/>
+          <w:szCs w:val="26"/>
+          <w:lang w:val="vi-VN"/>
+        </w:rPr>
+      </w:pPr>
+      <w:r>
+        <w:rPr>
+          <w:rFonts w:ascii="Times New Roman" w:eastAsiaTheme="minorEastAsia" w:hAnsi="Times New Roman" w:cs="Times New Roman"/>
+          <w:sz w:val="26"/>
+          <w:szCs w:val="26"/>
+          <w:lang w:val="vi-VN"/>
+        </w:rPr>
+        <w:t>Q1= (5000+7000 )/2=6000</w:t>
+      </w:r>
     </w:p>
     <w:p>
       <w:pPr>
@@ -2953,55 +2862,23 @@
       <w:pPr>
         <w:spacing w:line="26" w:lineRule="atLeast"/>
         <w:ind w:left="360"/>
-        <w:jc w:val="both"/>
-        <w:rPr>
-          <w:rFonts w:ascii="Times New Roman" w:eastAsiaTheme="minorEastAsia" w:hAnsi="Times New Roman" w:cs="Times New Roman"/>
-          <w:sz w:val="26"/>
-          <w:szCs w:val="26"/>
-          <w:lang w:val="vi-VN"/>
-        </w:rPr>
-      </w:pPr>
-      <m:oMathPara>
-        <m:oMath>
-          <m:r>
-            <w:rPr>
-              <w:rFonts w:ascii="Cambria Math" w:eastAsiaTheme="minorEastAsia" w:hAnsi="Cambria Math" w:cs="Times New Roman"/>
-              <w:sz w:val="26"/>
-              <w:szCs w:val="26"/>
-            </w:rPr>
-            <m:t>Q3=</m:t>
-          </m:r>
-          <m:d>
-            <m:dPr>
-              <m:ctrlPr>
-                <w:rPr>
-                  <w:rFonts w:ascii="Cambria Math" w:eastAsiaTheme="minorEastAsia" w:hAnsi="Cambria Math" w:cs="Times New Roman"/>
-                  <w:sz w:val="26"/>
-                  <w:szCs w:val="26"/>
-                </w:rPr>
-              </m:ctrlPr>
-            </m:dPr>
-            <m:e>
-              <m:r>
-                <w:rPr>
-                  <w:rFonts w:ascii="Cambria Math" w:eastAsiaTheme="minorEastAsia" w:hAnsi="Cambria Math" w:cs="Times New Roman"/>
-                  <w:sz w:val="26"/>
-                  <w:szCs w:val="26"/>
-                </w:rPr>
-                <m:t>8500+15000</m:t>
-              </m:r>
-            </m:e>
-          </m:d>
-          <m:r>
-            <w:rPr>
-              <w:rFonts w:ascii="Cambria Math" w:eastAsiaTheme="minorEastAsia" w:hAnsi="Cambria Math" w:cs="Times New Roman"/>
-              <w:sz w:val="26"/>
-              <w:szCs w:val="26"/>
-            </w:rPr>
-            <m:t>/2=11750</m:t>
-          </m:r>
-        </m:oMath>
-      </m:oMathPara>
+        <w:jc w:val="center"/>
+        <w:rPr>
+          <w:rFonts w:ascii="Times New Roman" w:eastAsiaTheme="minorEastAsia" w:hAnsi="Times New Roman" w:cs="Times New Roman"/>
+          <w:sz w:val="26"/>
+          <w:szCs w:val="26"/>
+          <w:lang w:val="vi-VN"/>
+        </w:rPr>
+      </w:pPr>
+      <w:r>
+        <w:rPr>
+          <w:rFonts w:ascii="Times New Roman" w:eastAsiaTheme="minorEastAsia" w:hAnsi="Times New Roman" w:cs="Times New Roman"/>
+          <w:sz w:val="26"/>
+          <w:szCs w:val="26"/>
+          <w:lang w:val="vi-VN"/>
+        </w:rPr>
+        <w:t>Q3=(8500+15000)/2=11750</w:t>
+      </w:r>
     </w:p>
     <w:p>
       <w:pPr>
@@ -3131,23 +3008,37 @@
         </w:rPr>
         <w:t xml:space="preserve">Theo quy ước tiêu chuẩn của John Tukey, bất kỳ giá trị nào vượt quá </w:t>
       </w:r>
-      <m:oMath>
-        <m:r>
-          <w:rPr>
-            <w:rFonts w:ascii="Cambria Math" w:eastAsiaTheme="minorEastAsia" w:hAnsi="Cambria Math" w:cs="Times New Roman"/>
-            <w:sz w:val="26"/>
-            <w:szCs w:val="26"/>
-          </w:rPr>
-          <m:t>1.5×IQR</m:t>
-        </m:r>
-      </m:oMath>
-      <w:r>
-        <w:rPr>
-          <w:rFonts w:ascii="Times New Roman" w:eastAsiaTheme="minorEastAsia" w:hAnsi="Times New Roman" w:cs="Times New Roman"/>
-          <w:sz w:val="26"/>
-          <w:szCs w:val="26"/>
-        </w:rPr>
-        <w:t xml:space="preserve"> tính từ mép hộp (</w:t>
+      <w:r>
+        <w:rPr>
+          <w:rFonts w:ascii="Times New Roman" w:eastAsiaTheme="minorEastAsia" w:hAnsi="Times New Roman" w:cs="Times New Roman"/>
+          <w:sz w:val="26"/>
+          <w:szCs w:val="26"/>
+        </w:rPr>
+        <w:t>1.5×IQR</w:t>
+      </w:r>
+      <w:r>
+        <w:rPr>
+          <w:rFonts w:ascii="Times New Roman" w:eastAsiaTheme="minorEastAsia" w:hAnsi="Times New Roman" w:cs="Times New Roman"/>
+          <w:sz w:val="26"/>
+          <w:szCs w:val="26"/>
+        </w:rPr>
+        <w:t xml:space="preserve"> </w:t>
+      </w:r>
+      <w:r>
+        <w:rPr>
+          <w:rFonts w:ascii="Times New Roman" w:eastAsiaTheme="minorEastAsia" w:hAnsi="Times New Roman" w:cs="Times New Roman"/>
+          <w:sz w:val="26"/>
+          <w:szCs w:val="26"/>
+        </w:rPr>
+        <w:t>t</w:t>
+      </w:r>
+      <w:r>
+        <w:rPr>
+          <w:rFonts w:ascii="Times New Roman" w:eastAsiaTheme="minorEastAsia" w:hAnsi="Times New Roman" w:cs="Times New Roman"/>
+          <w:sz w:val="26"/>
+          <w:szCs w:val="26"/>
+        </w:rPr>
+        <w:t>ính từ mép hộp (</w:t>
       </w:r>
       <m:oMath>
         <m:r>
@@ -3470,295 +3361,197 @@
     </w:p>
     <w:p>
       <w:pPr>
-        <w:jc w:val="both"/>
-        <w:rPr>
-          <w:rFonts w:ascii="Times New Roman" w:hAnsi="Times New Roman" w:cs="Times New Roman"/>
-          <w:sz w:val="26"/>
-          <w:szCs w:val="26"/>
-          <w:lang w:val="vi-VN"/>
-        </w:rPr>
-      </w:pPr>
-      <m:oMathPara>
-        <m:oMath>
-          <m:r>
-            <w:rPr>
-              <w:rFonts w:ascii="Cambria Math" w:hAnsi="Cambria Math" w:cs="Times New Roman"/>
-              <w:sz w:val="26"/>
-              <w:szCs w:val="26"/>
-            </w:rPr>
-            <m:t>X=</m:t>
-          </m:r>
-          <m:d>
-            <m:dPr>
-              <m:begChr m:val="{"/>
-              <m:endChr m:val="}"/>
-              <m:ctrlPr>
-                <w:rPr>
-                  <w:rFonts w:ascii="Cambria Math" w:hAnsi="Cambria Math" w:cs="Times New Roman"/>
-                  <w:sz w:val="26"/>
-                  <w:szCs w:val="26"/>
-                </w:rPr>
-              </m:ctrlPr>
-            </m:dPr>
-            <m:e>
-              <m:r>
-                <w:rPr>
-                  <w:rFonts w:ascii="Cambria Math" w:hAnsi="Cambria Math" w:cs="Times New Roman"/>
-                  <w:sz w:val="26"/>
-                  <w:szCs w:val="26"/>
-                </w:rPr>
-                <m:t>8000,5000,15000,-2000,7000,8500,30000,8200,7800</m:t>
-              </m:r>
-            </m:e>
-          </m:d>
-        </m:oMath>
-      </m:oMathPara>
-    </w:p>
-    <w:p>
-      <w:pPr>
-        <w:jc w:val="both"/>
-        <w:rPr>
-          <w:rFonts w:ascii="Times New Roman" w:hAnsi="Times New Roman" w:cs="Times New Roman"/>
-          <w:lang w:val="vi-VN"/>
-        </w:rPr>
-      </w:pPr>
-      <w:r>
-        <w:rPr>
-          <w:rFonts w:ascii="Times New Roman" w:hAnsi="Times New Roman" w:cs="Times New Roman"/>
-          <w:lang w:val="vi-VN"/>
-        </w:rPr>
-        <w:t xml:space="preserve"> Bước 2: Tính giá trị trung bình (</w:t>
-      </w:r>
-      <m:oMath>
-        <m:r>
-          <w:rPr>
-            <w:rFonts w:ascii="Cambria Math" w:hAnsi="Cambria Math" w:cs="Times New Roman"/>
-          </w:rPr>
-          <m:t>μ</m:t>
-        </m:r>
-      </m:oMath>
-      <w:r>
-        <w:rPr>
-          <w:rFonts w:ascii="Times New Roman" w:hAnsi="Times New Roman" w:cs="Times New Roman"/>
-        </w:rPr>
-        <w:t xml:space="preserve"> hoặc </w:t>
-      </w:r>
-      <m:oMath>
-        <m:acc>
-          <m:accPr>
-            <m:chr m:val="̅"/>
-            <m:ctrlPr>
-              <w:rPr>
-                <w:rFonts w:ascii="Cambria Math" w:hAnsi="Cambria Math" w:cs="Times New Roman"/>
-              </w:rPr>
-            </m:ctrlPr>
-          </m:accPr>
-          <m:e>
-            <m:r>
-              <w:rPr>
-                <w:rFonts w:ascii="Cambria Math" w:hAnsi="Cambria Math" w:cs="Times New Roman"/>
-              </w:rPr>
-              <m:t>X</m:t>
-            </m:r>
-          </m:e>
-        </m:acc>
-      </m:oMath>
-      <w:r>
-        <w:rPr>
-          <w:rFonts w:ascii="Times New Roman" w:hAnsi="Times New Roman" w:cs="Times New Roman"/>
-          <w:lang w:val="vi-VN"/>
-        </w:rPr>
-        <w:t>)</w:t>
-      </w:r>
-    </w:p>
-    <w:p>
-      <w:pPr>
-        <w:jc w:val="both"/>
-        <w:rPr>
-          <w:rFonts w:ascii="Times New Roman" w:eastAsiaTheme="minorEastAsia" w:hAnsi="Times New Roman" w:cs="Times New Roman"/>
-          <w:lang w:val="vi-VN"/>
-        </w:rPr>
-      </w:pPr>
-      <m:oMathPara>
-        <m:oMath>
-          <m:r>
-            <w:rPr>
-              <w:rFonts w:ascii="Cambria Math" w:hAnsi="Cambria Math" w:cs="Times New Roman"/>
-            </w:rPr>
-            <m:t>μ=</m:t>
-          </m:r>
-          <m:f>
-            <m:fPr>
-              <m:ctrlPr>
-                <w:rPr>
-                  <w:rFonts w:ascii="Cambria Math" w:hAnsi="Cambria Math" w:cs="Times New Roman"/>
-                </w:rPr>
-              </m:ctrlPr>
-            </m:fPr>
-            <m:num>
-              <m:r>
-                <w:rPr>
-                  <w:rFonts w:ascii="Cambria Math" w:hAnsi="Cambria Math" w:cs="Times New Roman"/>
-                </w:rPr>
-                <m:t>8000+5000+15000+</m:t>
-              </m:r>
-              <m:d>
-                <m:dPr>
-                  <m:ctrlPr>
-                    <w:rPr>
-                      <w:rFonts w:ascii="Cambria Math" w:hAnsi="Cambria Math" w:cs="Times New Roman"/>
-                    </w:rPr>
-                  </m:ctrlPr>
-                </m:dPr>
-                <m:e>
-                  <m:r>
-                    <w:rPr>
-                      <w:rFonts w:ascii="Cambria Math" w:hAnsi="Cambria Math" w:cs="Times New Roman"/>
-                    </w:rPr>
-                    <m:t>-2000</m:t>
-                  </m:r>
-                </m:e>
-              </m:d>
-              <m:r>
-                <w:rPr>
-                  <w:rFonts w:ascii="Cambria Math" w:hAnsi="Cambria Math" w:cs="Times New Roman"/>
-                </w:rPr>
-                <m:t>+7000+8500+30000+8200+7800</m:t>
-              </m:r>
-            </m:num>
-            <m:den>
-              <m:r>
-                <w:rPr>
-                  <w:rFonts w:ascii="Cambria Math" w:hAnsi="Cambria Math" w:cs="Times New Roman"/>
-                </w:rPr>
-                <m:t>9</m:t>
-              </m:r>
-            </m:den>
-          </m:f>
-          <m:r>
-            <w:rPr>
-              <w:rFonts w:ascii="Cambria Math" w:hAnsi="Cambria Math" w:cs="Times New Roman"/>
-            </w:rPr>
-            <m:t>=</m:t>
-          </m:r>
-          <m:f>
-            <m:fPr>
-              <m:ctrlPr>
-                <w:rPr>
-                  <w:rFonts w:ascii="Cambria Math" w:hAnsi="Cambria Math" w:cs="Times New Roman"/>
-                </w:rPr>
-              </m:ctrlPr>
-            </m:fPr>
-            <m:num>
-              <m:r>
-                <w:rPr>
-                  <w:rFonts w:ascii="Cambria Math" w:hAnsi="Cambria Math" w:cs="Times New Roman"/>
-                </w:rPr>
-                <m:t>87500</m:t>
-              </m:r>
-            </m:num>
-            <m:den>
-              <m:r>
-                <w:rPr>
-                  <w:rFonts w:ascii="Cambria Math" w:hAnsi="Cambria Math" w:cs="Times New Roman"/>
-                </w:rPr>
-                <m:t>9</m:t>
-              </m:r>
-            </m:den>
-          </m:f>
-          <m:r>
-            <w:rPr>
-              <w:rFonts w:ascii="Cambria Math" w:hAnsi="Cambria Math" w:cs="Times New Roman"/>
-            </w:rPr>
-            <m:t>~</m:t>
-          </m:r>
-          <m:r>
-            <w:rPr>
-              <w:rFonts w:ascii="Cambria Math" w:hAnsi="Cambria Math" w:cs="Times New Roman"/>
-              <w:lang w:val="vi-VN"/>
-            </w:rPr>
-            <m:t xml:space="preserve">~ </m:t>
-          </m:r>
-          <m:r>
-            <w:rPr>
-              <w:rFonts w:ascii="Cambria Math" w:hAnsi="Cambria Math" w:cs="Times New Roman"/>
-            </w:rPr>
-            <m:t>9722.22</m:t>
-          </m:r>
-        </m:oMath>
-      </m:oMathPara>
-    </w:p>
-    <w:p>
-      <w:pPr>
-        <w:jc w:val="both"/>
-        <w:rPr>
-          <w:rFonts w:ascii="Times New Roman" w:eastAsiaTheme="minorEastAsia" w:hAnsi="Times New Roman" w:cs="Times New Roman"/>
-          <w:lang w:val="vi-VN"/>
-        </w:rPr>
-      </w:pPr>
-      <w:r>
-        <w:rPr>
-          <w:rFonts w:ascii="Times New Roman" w:eastAsiaTheme="minorEastAsia" w:hAnsi="Times New Roman" w:cs="Times New Roman"/>
-          <w:lang w:val="vi-VN"/>
-        </w:rPr>
-        <w:t>Bước 3: Tính độ lệch chuẩn (</w:t>
-      </w:r>
-      <m:oMath>
-        <m:r>
-          <w:rPr>
-            <w:rFonts w:ascii="Cambria Math" w:eastAsiaTheme="minorEastAsia" w:hAnsi="Cambria Math" w:cs="Times New Roman"/>
-          </w:rPr>
-          <m:t>σ</m:t>
-        </m:r>
-      </m:oMath>
-      <w:r>
-        <w:rPr>
-          <w:rFonts w:ascii="Times New Roman" w:eastAsiaTheme="minorEastAsia" w:hAnsi="Times New Roman" w:cs="Times New Roman"/>
-        </w:rPr>
-        <w:t xml:space="preserve"> hoặc </w:t>
-      </w:r>
-      <m:oMath>
-        <m:r>
-          <w:rPr>
-            <w:rFonts w:ascii="Cambria Math" w:eastAsiaTheme="minorEastAsia" w:hAnsi="Cambria Math" w:cs="Times New Roman"/>
-          </w:rPr>
-          <m:t>s</m:t>
-        </m:r>
-      </m:oMath>
-      <w:r>
-        <w:rPr>
-          <w:rFonts w:ascii="Times New Roman" w:eastAsiaTheme="minorEastAsia" w:hAnsi="Times New Roman" w:cs="Times New Roman"/>
-          <w:lang w:val="vi-VN"/>
-        </w:rPr>
-        <w:t>)</w:t>
-      </w:r>
-    </w:p>
-    <w:p>
-      <w:pPr>
-        <w:jc w:val="both"/>
-        <w:rPr>
-          <w:rFonts w:ascii="Times New Roman" w:eastAsiaTheme="minorEastAsia" w:hAnsi="Times New Roman" w:cs="Times New Roman"/>
-        </w:rPr>
-      </w:pPr>
-      <w:r>
-        <w:rPr>
-          <w:rFonts w:ascii="Times New Roman" w:eastAsiaTheme="minorEastAsia" w:hAnsi="Times New Roman" w:cs="Times New Roman"/>
-        </w:rPr>
-        <w:t>Tính theo độ lệch chuẩn mẫu (</w:t>
-      </w:r>
-      <m:oMath>
-        <m:r>
-          <w:rPr>
-            <w:rFonts w:ascii="Cambria Math" w:eastAsiaTheme="minorEastAsia" w:hAnsi="Cambria Math" w:cs="Times New Roman"/>
-          </w:rPr>
-          <m:t>n-1=8</m:t>
-        </m:r>
-      </m:oMath>
-      <w:r>
-        <w:rPr>
-          <w:rFonts w:ascii="Times New Roman" w:eastAsiaTheme="minorEastAsia" w:hAnsi="Times New Roman" w:cs="Times New Roman"/>
-        </w:rPr>
-        <w:t>):</w:t>
+        <w:jc w:val="center"/>
+        <w:rPr>
+          <w:rFonts w:ascii="Times New Roman" w:hAnsi="Times New Roman" w:cs="Times New Roman"/>
+          <w:iCs/>
+          <w:sz w:val="26"/>
+          <w:szCs w:val="26"/>
+          <w:lang w:val="vi-VN"/>
+        </w:rPr>
+      </w:pPr>
+      <w:r>
+        <w:rPr>
+          <w:rFonts w:ascii="Times New Roman" w:hAnsi="Times New Roman" w:cs="Times New Roman"/>
+          <w:iCs/>
+          <w:sz w:val="26"/>
+          <w:szCs w:val="26"/>
+          <w:lang w:val="vi-VN"/>
+        </w:rPr>
+        <w:t>X={8000,5000,15000,-2000,7000,8500,30000,8200,7800}</w:t>
+      </w:r>
+    </w:p>
+    <w:p>
+      <w:pPr>
+        <w:jc w:val="both"/>
+        <w:rPr>
+          <w:rFonts w:ascii="Times New Roman" w:hAnsi="Times New Roman" w:cs="Times New Roman"/>
+          <w:lang w:val="vi-VN"/>
+        </w:rPr>
+      </w:pPr>
+      <w:r>
+        <w:rPr>
+          <w:rFonts w:ascii="Times New Roman" w:hAnsi="Times New Roman" w:cs="Times New Roman"/>
+          <w:lang w:val="vi-VN"/>
+        </w:rPr>
+        <w:t xml:space="preserve"> Bước 2: Tính giá trị trung bình </w:t>
+      </w:r>
+      <w:r>
+        <w:rPr>
+          <w:rFonts w:ascii="Times New Roman" w:hAnsi="Times New Roman" w:cs="Times New Roman"/>
+          <w:lang w:val="vi-VN"/>
+        </w:rPr>
+        <w:t>(μ hoặc X ̅)</w:t>
+      </w:r>
+    </w:p>
+    <w:p>
+      <w:pPr>
+        <w:jc w:val="both"/>
+        <w:rPr>
+          <w:rFonts w:ascii="Times New Roman" w:hAnsi="Times New Roman" w:cs="Times New Roman"/>
+          <w:lang w:val="vi-VN"/>
+        </w:rPr>
+      </w:pPr>
+      <w:r>
+        <w:rPr>
+          <w:rFonts w:ascii="Times New Roman" w:hAnsi="Times New Roman" w:cs="Times New Roman"/>
+          <w:lang w:val="vi-VN"/>
+        </w:rPr>
+        <w:t>μ=</w:t>
+      </w:r>
+      <w:r>
+        <w:rPr>
+          <w:rFonts w:ascii="Times New Roman" w:hAnsi="Times New Roman" w:cs="Times New Roman"/>
+          <w:lang w:val="vi-VN"/>
+        </w:rPr>
+        <w:t xml:space="preserve"> </w:t>
+      </w:r>
+      <w:r>
+        <w:rPr>
+          <w:rFonts w:ascii="Times New Roman" w:hAnsi="Times New Roman" w:cs="Times New Roman"/>
+          <w:lang w:val="vi-VN"/>
+        </w:rPr>
+        <w:t>(8000+5000+15000+(-2000)+7000+8500+30000+8200+7800)</w:t>
+      </w:r>
+      <w:r>
+        <w:rPr>
+          <w:rFonts w:ascii="Times New Roman" w:hAnsi="Times New Roman" w:cs="Times New Roman"/>
+          <w:lang w:val="vi-VN"/>
+        </w:rPr>
+        <w:t xml:space="preserve"> </w:t>
+      </w:r>
+      <w:r>
+        <w:rPr>
+          <w:rFonts w:ascii="Times New Roman" w:hAnsi="Times New Roman" w:cs="Times New Roman"/>
+          <w:lang w:val="vi-VN"/>
+        </w:rPr>
+        <w:t>/</w:t>
+      </w:r>
+      <w:r>
+        <w:rPr>
+          <w:rFonts w:ascii="Times New Roman" w:hAnsi="Times New Roman" w:cs="Times New Roman"/>
+          <w:lang w:val="vi-VN"/>
+        </w:rPr>
+        <w:t xml:space="preserve"> </w:t>
+      </w:r>
+      <w:r>
+        <w:rPr>
+          <w:rFonts w:ascii="Times New Roman" w:hAnsi="Times New Roman" w:cs="Times New Roman"/>
+          <w:lang w:val="vi-VN"/>
+        </w:rPr>
+        <w:t>9</w:t>
+      </w:r>
+      <w:r>
+        <w:rPr>
+          <w:rFonts w:ascii="Times New Roman" w:hAnsi="Times New Roman" w:cs="Times New Roman"/>
+          <w:lang w:val="vi-VN"/>
+        </w:rPr>
+        <w:t xml:space="preserve"> </w:t>
+      </w:r>
+      <w:r>
+        <w:rPr>
+          <w:rFonts w:ascii="Times New Roman" w:hAnsi="Times New Roman" w:cs="Times New Roman"/>
+          <w:lang w:val="vi-VN"/>
+        </w:rPr>
+        <w:t>=</w:t>
+      </w:r>
+      <w:r>
+        <w:rPr>
+          <w:rFonts w:ascii="Times New Roman" w:hAnsi="Times New Roman" w:cs="Times New Roman"/>
+          <w:lang w:val="vi-VN"/>
+        </w:rPr>
+        <w:t xml:space="preserve"> </w:t>
+      </w:r>
+      <w:r>
+        <w:rPr>
+          <w:rFonts w:ascii="Times New Roman" w:hAnsi="Times New Roman" w:cs="Times New Roman"/>
+          <w:lang w:val="vi-VN"/>
+        </w:rPr>
+        <w:t>87500/9</w:t>
+      </w:r>
+      <w:r>
+        <w:rPr>
+          <w:rFonts w:ascii="Times New Roman" w:hAnsi="Times New Roman" w:cs="Times New Roman"/>
+          <w:lang w:val="vi-VN"/>
+        </w:rPr>
+        <w:t xml:space="preserve"> </w:t>
+      </w:r>
+      <w:r>
+        <w:rPr>
+          <w:rFonts w:ascii="Times New Roman" w:hAnsi="Times New Roman" w:cs="Times New Roman"/>
+          <w:lang w:val="vi-VN"/>
+        </w:rPr>
+        <w:t>~~ 9722.22</w:t>
+      </w:r>
+    </w:p>
+    <w:p>
+      <w:pPr>
+        <w:jc w:val="both"/>
+        <w:rPr>
+          <w:rFonts w:ascii="Times New Roman" w:eastAsiaTheme="minorEastAsia" w:hAnsi="Times New Roman" w:cs="Times New Roman"/>
+          <w:lang w:val="vi-VN"/>
+        </w:rPr>
+      </w:pPr>
+      <w:r>
+        <w:rPr>
+          <w:rFonts w:ascii="Times New Roman" w:eastAsiaTheme="minorEastAsia" w:hAnsi="Times New Roman" w:cs="Times New Roman"/>
+          <w:lang w:val="vi-VN"/>
+        </w:rPr>
+        <w:t xml:space="preserve">Bước 3: Tính độ lệch chuẩn </w:t>
+      </w:r>
+      <w:r>
+        <w:rPr>
+          <w:rFonts w:ascii="Times New Roman" w:eastAsiaTheme="minorEastAsia" w:hAnsi="Times New Roman" w:cs="Times New Roman"/>
+          <w:lang w:val="vi-VN"/>
+        </w:rPr>
+        <w:t>(σ hoặc s)</w:t>
+      </w:r>
+    </w:p>
+    <w:p>
+      <w:pPr>
+        <w:jc w:val="both"/>
+        <w:rPr>
+          <w:rFonts w:ascii="Times New Roman" w:eastAsiaTheme="minorEastAsia" w:hAnsi="Times New Roman" w:cs="Times New Roman"/>
+        </w:rPr>
+      </w:pPr>
+      <w:r>
+        <w:rPr>
+          <w:rFonts w:ascii="Times New Roman" w:eastAsiaTheme="minorEastAsia" w:hAnsi="Times New Roman" w:cs="Times New Roman"/>
+        </w:rPr>
+        <w:t xml:space="preserve">Tính theo độ lệch chuẩn mẫu </w:t>
+      </w:r>
+      <w:r>
+        <w:rPr>
+          <w:rFonts w:ascii="Times New Roman" w:eastAsiaTheme="minorEastAsia" w:hAnsi="Times New Roman" w:cs="Times New Roman"/>
+          <w:lang w:val="vi-VN"/>
+        </w:rPr>
+        <w:t>(</w:t>
+      </w:r>
+      <w:r>
+        <w:rPr>
+          <w:rFonts w:ascii="Times New Roman" w:eastAsiaTheme="minorEastAsia" w:hAnsi="Times New Roman" w:cs="Times New Roman"/>
+        </w:rPr>
+        <w:t>n-1=8):</w:t>
       </w:r>
     </w:p>
     <w:p>
@@ -4111,16 +3904,50 @@
         <w:rPr>
           <w:rFonts w:ascii="Times New Roman" w:eastAsiaTheme="minorEastAsia" w:hAnsi="Times New Roman" w:cs="Times New Roman"/>
         </w:rPr>
-        <w:t xml:space="preserve">thì </w:t>
-      </w:r>
-      <m:oMath>
-        <m:r>
-          <w:rPr>
-            <w:rFonts w:ascii="Cambria Math" w:eastAsiaTheme="minorEastAsia" w:hAnsi="Cambria Math" w:cs="Times New Roman"/>
-          </w:rPr>
-          <m:t>σ≈8634.83.</m:t>
-        </m:r>
-      </m:oMath>
+        <w:t>thì</w:t>
+      </w:r>
+      <w:r>
+        <w:rPr>
+          <w:rFonts w:ascii="Times New Roman" w:eastAsiaTheme="minorEastAsia" w:hAnsi="Times New Roman" w:cs="Times New Roman"/>
+          <w:lang w:val="vi-VN"/>
+        </w:rPr>
+        <w:t xml:space="preserve"> </w:t>
+      </w:r>
+      <w:r>
+        <w:rPr>
+          <w:rFonts w:ascii="Times New Roman" w:eastAsiaTheme="minorEastAsia" w:hAnsi="Times New Roman" w:cs="Times New Roman"/>
+          <w:lang w:val="vi-VN"/>
+        </w:rPr>
+        <w:t>ì σ</w:t>
+      </w:r>
+      <w:r>
+        <w:rPr>
+          <w:rFonts w:ascii="Times New Roman" w:eastAsiaTheme="minorEastAsia" w:hAnsi="Times New Roman" w:cs="Times New Roman"/>
+          <w:lang w:val="vi-VN"/>
+        </w:rPr>
+        <w:t xml:space="preserve"> </w:t>
+      </w:r>
+      <w:r>
+        <w:rPr>
+          <w:rFonts w:ascii="Times New Roman" w:eastAsiaTheme="minorEastAsia" w:hAnsi="Times New Roman" w:cs="Times New Roman"/>
+          <w:lang w:val="vi-VN"/>
+        </w:rPr>
+        <w:t>≈</w:t>
+      </w:r>
+      <w:r>
+        <w:rPr>
+          <w:rFonts w:ascii="Times New Roman" w:eastAsiaTheme="minorEastAsia" w:hAnsi="Times New Roman" w:cs="Times New Roman"/>
+          <w:lang w:val="vi-VN"/>
+        </w:rPr>
+        <w:t xml:space="preserve"> </w:t>
+      </w:r>
+      <w:r>
+        <w:rPr>
+          <w:rFonts w:ascii="Times New Roman" w:eastAsiaTheme="minorEastAsia" w:hAnsi="Times New Roman" w:cs="Times New Roman"/>
+          <w:lang w:val="vi-VN"/>
+        </w:rPr>
+        <w:t>8634.83.</w:t>
+      </w:r>
       <w:r>
         <w:rPr>
           <w:rFonts w:ascii="Times New Roman" w:eastAsiaTheme="minorEastAsia" w:hAnsi="Times New Roman" w:cs="Times New Roman"/>
@@ -4171,55 +3998,24 @@
         </w:rPr>
         <w:t xml:space="preserve">Bước 4: áp dụng công thức </w:t>
       </w:r>
-      <m:oMath>
-        <m:r>
-          <w:rPr>
-            <w:rFonts w:ascii="Cambria Math" w:eastAsiaTheme="minorEastAsia" w:hAnsi="Cambria Math" w:cs="Times New Roman"/>
-            <w:sz w:val="26"/>
-            <w:szCs w:val="26"/>
-          </w:rPr>
-          <m:t>Z=</m:t>
-        </m:r>
-        <m:f>
-          <m:fPr>
-            <m:ctrlPr>
-              <w:rPr>
-                <w:rFonts w:ascii="Cambria Math" w:eastAsiaTheme="minorEastAsia" w:hAnsi="Cambria Math" w:cs="Times New Roman"/>
-                <w:sz w:val="26"/>
-                <w:szCs w:val="26"/>
-              </w:rPr>
-            </m:ctrlPr>
-          </m:fPr>
-          <m:num>
-            <m:r>
-              <w:rPr>
-                <w:rFonts w:ascii="Cambria Math" w:eastAsiaTheme="minorEastAsia" w:hAnsi="Cambria Math" w:cs="Times New Roman"/>
-                <w:sz w:val="26"/>
-                <w:szCs w:val="26"/>
-              </w:rPr>
-              <m:t>X-μ</m:t>
-            </m:r>
-          </m:num>
-          <m:den>
-            <m:r>
-              <w:rPr>
-                <w:rFonts w:ascii="Cambria Math" w:eastAsiaTheme="minorEastAsia" w:hAnsi="Cambria Math" w:cs="Times New Roman"/>
-                <w:sz w:val="26"/>
-                <w:szCs w:val="26"/>
-              </w:rPr>
-              <m:t>σ</m:t>
-            </m:r>
-          </m:den>
-        </m:f>
-      </m:oMath>
-      <w:r>
-        <w:rPr>
-          <w:rFonts w:ascii="Times New Roman" w:eastAsiaTheme="minorEastAsia" w:hAnsi="Times New Roman" w:cs="Times New Roman"/>
-          <w:sz w:val="26"/>
-          <w:szCs w:val="26"/>
-          <w:lang w:val="vi-VN"/>
-        </w:rPr>
-        <w:t xml:space="preserve"> cho từng mẫu</w:t>
+      <w:r>
+        <w:rPr>
+          <w:rFonts w:ascii="Times New Roman" w:eastAsiaTheme="minorEastAsia" w:hAnsi="Times New Roman" w:cs="Times New Roman"/>
+          <w:iCs/>
+          <w:sz w:val="26"/>
+          <w:szCs w:val="26"/>
+          <w:lang w:val="vi-VN"/>
+        </w:rPr>
+        <w:t xml:space="preserve">Z=(X-μ)/σ </w:t>
+      </w:r>
+      <w:r>
+        <w:rPr>
+          <w:rFonts w:ascii="Times New Roman" w:eastAsiaTheme="minorEastAsia" w:hAnsi="Times New Roman" w:cs="Times New Roman"/>
+          <w:sz w:val="26"/>
+          <w:szCs w:val="26"/>
+          <w:lang w:val="vi-VN"/>
+        </w:rPr>
+        <w:t>cho từng mẫu</w:t>
       </w:r>
     </w:p>
     <w:tbl>
@@ -4319,49 +4115,8 @@
                 <w:szCs w:val="26"/>
                 <w:lang w:val="vi-VN"/>
               </w:rPr>
-              <w:t>Phép tính</w:t>
+              <w:t>Phép tínhZ=(X-9722.22)/9158.71</w:t>
             </w:r>
-            <m:oMath>
-              <m:r>
-                <w:rPr>
-                  <w:rFonts w:ascii="Cambria Math" w:eastAsiaTheme="minorEastAsia" w:hAnsi="Cambria Math" w:cs="Times New Roman"/>
-                  <w:sz w:val="26"/>
-                  <w:szCs w:val="26"/>
-                </w:rPr>
-                <m:t>Z=</m:t>
-              </m:r>
-              <m:f>
-                <m:fPr>
-                  <m:ctrlPr>
-                    <w:rPr>
-                      <w:rFonts w:ascii="Cambria Math" w:eastAsiaTheme="minorEastAsia" w:hAnsi="Cambria Math" w:cs="Times New Roman"/>
-                      <w:sz w:val="26"/>
-                      <w:szCs w:val="26"/>
-                    </w:rPr>
-                  </m:ctrlPr>
-                </m:fPr>
-                <m:num>
-                  <m:r>
-                    <w:rPr>
-                      <w:rFonts w:ascii="Cambria Math" w:eastAsiaTheme="minorEastAsia" w:hAnsi="Cambria Math" w:cs="Times New Roman"/>
-                      <w:sz w:val="26"/>
-                      <w:szCs w:val="26"/>
-                    </w:rPr>
-                    <m:t>X-9722.22</m:t>
-                  </m:r>
-                </m:num>
-                <m:den>
-                  <m:r>
-                    <w:rPr>
-                      <w:rFonts w:ascii="Cambria Math" w:eastAsiaTheme="minorEastAsia" w:hAnsi="Cambria Math" w:cs="Times New Roman"/>
-                      <w:sz w:val="26"/>
-                      <w:szCs w:val="26"/>
-                    </w:rPr>
-                    <m:t>9158.71</m:t>
-                  </m:r>
-                </m:den>
-              </m:f>
-            </m:oMath>
           </w:p>
         </w:tc>
         <w:tc>
@@ -4461,7 +4216,6 @@
           <w:p>
             <w:pPr>
               <w:ind w:firstLine="720"/>
-              <w:jc w:val="center"/>
               <w:rPr>
                 <w:rFonts w:ascii="Times New Roman" w:eastAsiaTheme="minorEastAsia" w:hAnsi="Times New Roman" w:cs="Times New Roman"/>
                 <w:iCs/>
@@ -4470,39 +4224,56 @@
                 <w:lang w:val="vi-VN"/>
               </w:rPr>
             </w:pPr>
-            <m:oMathPara>
-              <m:oMath>
-                <m:d>
-                  <m:dPr>
-                    <m:ctrlPr>
-                      <w:rPr>
-                        <w:rFonts w:ascii="Cambria Math" w:eastAsiaTheme="minorEastAsia" w:hAnsi="Cambria Math" w:cs="Times New Roman"/>
-                        <w:sz w:val="26"/>
-                        <w:szCs w:val="26"/>
-                      </w:rPr>
-                    </m:ctrlPr>
-                  </m:dPr>
-                  <m:e>
-                    <m:r>
-                      <w:rPr>
-                        <w:rFonts w:ascii="Cambria Math" w:eastAsiaTheme="minorEastAsia" w:hAnsi="Cambria Math" w:cs="Times New Roman"/>
-                        <w:sz w:val="26"/>
-                        <w:szCs w:val="26"/>
-                      </w:rPr>
-                      <m:t>8000-9722.22</m:t>
-                    </m:r>
-                  </m:e>
-                </m:d>
-                <m:r>
-                  <w:rPr>
-                    <w:rFonts w:ascii="Cambria Math" w:eastAsiaTheme="minorEastAsia" w:hAnsi="Cambria Math" w:cs="Times New Roman"/>
-                    <w:sz w:val="26"/>
-                    <w:szCs w:val="26"/>
-                  </w:rPr>
-                  <m:t>/9158.71</m:t>
-                </m:r>
-              </m:oMath>
-            </m:oMathPara>
+            <w:r>
+              <w:rPr>
+                <w:rFonts w:ascii="Times New Roman" w:eastAsiaTheme="minorEastAsia" w:hAnsi="Times New Roman" w:cs="Times New Roman"/>
+                <w:iCs/>
+                <w:sz w:val="26"/>
+                <w:szCs w:val="26"/>
+                <w:lang w:val="vi-VN"/>
+              </w:rPr>
+              <w:t>(8000-9722.22)</w:t>
+            </w:r>
+            <w:r>
+              <w:rPr>
+                <w:rFonts w:ascii="Times New Roman" w:eastAsiaTheme="minorEastAsia" w:hAnsi="Times New Roman" w:cs="Times New Roman"/>
+                <w:iCs/>
+                <w:sz w:val="26"/>
+                <w:szCs w:val="26"/>
+                <w:lang w:val="vi-VN"/>
+              </w:rPr>
+              <w:t xml:space="preserve"> </w:t>
+            </w:r>
+            <w:r>
+              <w:rPr>
+                <w:rFonts w:ascii="Times New Roman" w:eastAsiaTheme="minorEastAsia" w:hAnsi="Times New Roman" w:cs="Times New Roman"/>
+                <w:iCs/>
+                <w:sz w:val="26"/>
+                <w:szCs w:val="26"/>
+                <w:lang w:val="vi-VN"/>
+              </w:rPr>
+              <w:t>/</w:t>
+            </w:r>
+            <w:r>
+              <w:rPr>
+                <w:rFonts w:ascii="Times New Roman" w:eastAsiaTheme="minorEastAsia" w:hAnsi="Times New Roman" w:cs="Times New Roman"/>
+                <w:iCs/>
+                <w:sz w:val="26"/>
+                <w:szCs w:val="26"/>
+                <w:lang w:val="vi-VN"/>
+              </w:rPr>
+              <w:t xml:space="preserve"> </w:t>
+            </w:r>
+            <w:r>
+              <w:rPr>
+                <w:rFonts w:ascii="Times New Roman" w:eastAsiaTheme="minorEastAsia" w:hAnsi="Times New Roman" w:cs="Times New Roman"/>
+                <w:iCs/>
+                <w:sz w:val="26"/>
+                <w:szCs w:val="26"/>
+                <w:lang w:val="vi-VN"/>
+              </w:rPr>
+              <w:t>9158.71</w:t>
+            </w:r>
           </w:p>
         </w:tc>
         <w:tc>
@@ -4739,39 +4510,16 @@
                 <w:lang w:val="vi-VN"/>
               </w:rPr>
             </w:pPr>
-            <m:oMathPara>
-              <m:oMath>
-                <m:d>
-                  <m:dPr>
-                    <m:ctrlPr>
-                      <w:rPr>
-                        <w:rFonts w:ascii="Cambria Math" w:eastAsiaTheme="minorEastAsia" w:hAnsi="Cambria Math" w:cs="Times New Roman"/>
-                        <w:sz w:val="26"/>
-                        <w:szCs w:val="26"/>
-                      </w:rPr>
-                    </m:ctrlPr>
-                  </m:dPr>
-                  <m:e>
-                    <m:r>
-                      <w:rPr>
-                        <w:rFonts w:ascii="Cambria Math" w:eastAsiaTheme="minorEastAsia" w:hAnsi="Cambria Math" w:cs="Times New Roman"/>
-                        <w:sz w:val="26"/>
-                        <w:szCs w:val="26"/>
-                      </w:rPr>
-                      <m:t>5000-9722.22</m:t>
-                    </m:r>
-                  </m:e>
-                </m:d>
-                <m:r>
-                  <w:rPr>
-                    <w:rFonts w:ascii="Cambria Math" w:eastAsiaTheme="minorEastAsia" w:hAnsi="Cambria Math" w:cs="Times New Roman"/>
-                    <w:sz w:val="26"/>
-                    <w:szCs w:val="26"/>
-                  </w:rPr>
-                  <m:t>/9158.71</m:t>
-                </m:r>
-              </m:oMath>
-            </m:oMathPara>
+            <w:r>
+              <w:rPr>
+                <w:rFonts w:ascii="Times New Roman" w:eastAsiaTheme="minorEastAsia" w:hAnsi="Times New Roman" w:cs="Times New Roman"/>
+                <w:iCs/>
+                <w:sz w:val="26"/>
+                <w:szCs w:val="26"/>
+                <w:lang w:val="vi-VN"/>
+              </w:rPr>
+              <w:t>(5000-9722.22)/9158.71</w:t>
+            </w:r>
           </w:p>
         </w:tc>
         <w:tc>
@@ -4879,39 +4627,16 @@
                 <w:lang w:val="vi-VN"/>
               </w:rPr>
             </w:pPr>
-            <m:oMathPara>
-              <m:oMath>
-                <m:d>
-                  <m:dPr>
-                    <m:ctrlPr>
-                      <w:rPr>
-                        <w:rFonts w:ascii="Cambria Math" w:eastAsiaTheme="minorEastAsia" w:hAnsi="Cambria Math" w:cs="Times New Roman"/>
-                        <w:sz w:val="26"/>
-                        <w:szCs w:val="26"/>
-                      </w:rPr>
-                    </m:ctrlPr>
-                  </m:dPr>
-                  <m:e>
-                    <m:r>
-                      <w:rPr>
-                        <w:rFonts w:ascii="Cambria Math" w:eastAsiaTheme="minorEastAsia" w:hAnsi="Cambria Math" w:cs="Times New Roman"/>
-                        <w:sz w:val="26"/>
-                        <w:szCs w:val="26"/>
-                      </w:rPr>
-                      <m:t>15000-9722.22</m:t>
-                    </m:r>
-                  </m:e>
-                </m:d>
-                <m:r>
-                  <w:rPr>
-                    <w:rFonts w:ascii="Cambria Math" w:eastAsiaTheme="minorEastAsia" w:hAnsi="Cambria Math" w:cs="Times New Roman"/>
-                    <w:sz w:val="26"/>
-                    <w:szCs w:val="26"/>
-                  </w:rPr>
-                  <m:t>/9158.71</m:t>
-                </m:r>
-              </m:oMath>
-            </m:oMathPara>
+            <w:r>
+              <w:rPr>
+                <w:rFonts w:ascii="Times New Roman" w:eastAsiaTheme="minorEastAsia" w:hAnsi="Times New Roman" w:cs="Times New Roman"/>
+                <w:iCs/>
+                <w:sz w:val="26"/>
+                <w:szCs w:val="26"/>
+                <w:lang w:val="vi-VN"/>
+              </w:rPr>
+              <w:t>(15000-9722.22)/9158.71</w:t>
+            </w:r>
           </w:p>
         </w:tc>
         <w:tc>
@@ -5018,39 +4743,16 @@
                 <w:lang w:val="vi-VN"/>
               </w:rPr>
             </w:pPr>
-            <m:oMathPara>
-              <m:oMath>
-                <m:d>
-                  <m:dPr>
-                    <m:ctrlPr>
-                      <w:rPr>
-                        <w:rFonts w:ascii="Cambria Math" w:eastAsiaTheme="minorEastAsia" w:hAnsi="Cambria Math" w:cs="Times New Roman"/>
-                        <w:sz w:val="26"/>
-                        <w:szCs w:val="26"/>
-                      </w:rPr>
-                    </m:ctrlPr>
-                  </m:dPr>
-                  <m:e>
-                    <m:r>
-                      <w:rPr>
-                        <w:rFonts w:ascii="Cambria Math" w:eastAsiaTheme="minorEastAsia" w:hAnsi="Cambria Math" w:cs="Times New Roman"/>
-                        <w:sz w:val="26"/>
-                        <w:szCs w:val="26"/>
-                      </w:rPr>
-                      <m:t>-2000-9722.22</m:t>
-                    </m:r>
-                  </m:e>
-                </m:d>
-                <m:r>
-                  <w:rPr>
-                    <w:rFonts w:ascii="Cambria Math" w:eastAsiaTheme="minorEastAsia" w:hAnsi="Cambria Math" w:cs="Times New Roman"/>
-                    <w:sz w:val="26"/>
-                    <w:szCs w:val="26"/>
-                  </w:rPr>
-                  <m:t>/9158.71</m:t>
-                </m:r>
-              </m:oMath>
-            </m:oMathPara>
+            <w:r>
+              <w:rPr>
+                <w:rFonts w:ascii="Times New Roman" w:eastAsiaTheme="minorEastAsia" w:hAnsi="Times New Roman" w:cs="Times New Roman"/>
+                <w:iCs/>
+                <w:sz w:val="26"/>
+                <w:szCs w:val="26"/>
+                <w:lang w:val="vi-VN"/>
+              </w:rPr>
+              <w:t>(-2000-9722.22)/9158.71</w:t>
+            </w:r>
           </w:p>
         </w:tc>
         <w:tc>
@@ -5157,39 +4859,16 @@
                 <w:lang w:val="vi-VN"/>
               </w:rPr>
             </w:pPr>
-            <m:oMathPara>
-              <m:oMath>
-                <m:d>
-                  <m:dPr>
-                    <m:ctrlPr>
-                      <w:rPr>
-                        <w:rFonts w:ascii="Cambria Math" w:eastAsiaTheme="minorEastAsia" w:hAnsi="Cambria Math" w:cs="Times New Roman"/>
-                        <w:sz w:val="26"/>
-                        <w:szCs w:val="26"/>
-                      </w:rPr>
-                    </m:ctrlPr>
-                  </m:dPr>
-                  <m:e>
-                    <m:r>
-                      <w:rPr>
-                        <w:rFonts w:ascii="Cambria Math" w:eastAsiaTheme="minorEastAsia" w:hAnsi="Cambria Math" w:cs="Times New Roman"/>
-                        <w:sz w:val="26"/>
-                        <w:szCs w:val="26"/>
-                      </w:rPr>
-                      <m:t>7000-9722.22</m:t>
-                    </m:r>
-                  </m:e>
-                </m:d>
-                <m:r>
-                  <w:rPr>
-                    <w:rFonts w:ascii="Cambria Math" w:eastAsiaTheme="minorEastAsia" w:hAnsi="Cambria Math" w:cs="Times New Roman"/>
-                    <w:sz w:val="26"/>
-                    <w:szCs w:val="26"/>
-                  </w:rPr>
-                  <m:t>/9158.71</m:t>
-                </m:r>
-              </m:oMath>
-            </m:oMathPara>
+            <w:r>
+              <w:rPr>
+                <w:rFonts w:ascii="Times New Roman" w:eastAsiaTheme="minorEastAsia" w:hAnsi="Times New Roman" w:cs="Times New Roman"/>
+                <w:iCs/>
+                <w:sz w:val="26"/>
+                <w:szCs w:val="26"/>
+                <w:lang w:val="vi-VN"/>
+              </w:rPr>
+              <w:t>(7000-9722.22)/9158.71</w:t>
+            </w:r>
           </w:p>
         </w:tc>
         <w:tc>
@@ -5296,39 +4975,16 @@
                 <w:lang w:val="vi-VN"/>
               </w:rPr>
             </w:pPr>
-            <m:oMathPara>
-              <m:oMath>
-                <m:d>
-                  <m:dPr>
-                    <m:ctrlPr>
-                      <w:rPr>
-                        <w:rFonts w:ascii="Cambria Math" w:eastAsiaTheme="minorEastAsia" w:hAnsi="Cambria Math" w:cs="Times New Roman"/>
-                        <w:sz w:val="26"/>
-                        <w:szCs w:val="26"/>
-                      </w:rPr>
-                    </m:ctrlPr>
-                  </m:dPr>
-                  <m:e>
-                    <m:r>
-                      <w:rPr>
-                        <w:rFonts w:ascii="Cambria Math" w:eastAsiaTheme="minorEastAsia" w:hAnsi="Cambria Math" w:cs="Times New Roman"/>
-                        <w:sz w:val="26"/>
-                        <w:szCs w:val="26"/>
-                      </w:rPr>
-                      <m:t>8500-9722.22</m:t>
-                    </m:r>
-                  </m:e>
-                </m:d>
-                <m:r>
-                  <w:rPr>
-                    <w:rFonts w:ascii="Cambria Math" w:eastAsiaTheme="minorEastAsia" w:hAnsi="Cambria Math" w:cs="Times New Roman"/>
-                    <w:sz w:val="26"/>
-                    <w:szCs w:val="26"/>
-                  </w:rPr>
-                  <m:t>/9158.71</m:t>
-                </m:r>
-              </m:oMath>
-            </m:oMathPara>
+            <w:r>
+              <w:rPr>
+                <w:rFonts w:ascii="Times New Roman" w:eastAsiaTheme="minorEastAsia" w:hAnsi="Times New Roman" w:cs="Times New Roman"/>
+                <w:iCs/>
+                <w:sz w:val="26"/>
+                <w:szCs w:val="26"/>
+                <w:lang w:val="vi-VN"/>
+              </w:rPr>
+              <w:t>(8500-9722.22)/9158.71</w:t>
+            </w:r>
           </w:p>
         </w:tc>
         <w:tc>
@@ -5435,39 +5091,16 @@
                 <w:lang w:val="vi-VN"/>
               </w:rPr>
             </w:pPr>
-            <m:oMathPara>
-              <m:oMath>
-                <m:d>
-                  <m:dPr>
-                    <m:ctrlPr>
-                      <w:rPr>
-                        <w:rFonts w:ascii="Cambria Math" w:eastAsiaTheme="minorEastAsia" w:hAnsi="Cambria Math" w:cs="Times New Roman"/>
-                        <w:sz w:val="26"/>
-                        <w:szCs w:val="26"/>
-                      </w:rPr>
-                    </m:ctrlPr>
-                  </m:dPr>
-                  <m:e>
-                    <m:r>
-                      <w:rPr>
-                        <w:rFonts w:ascii="Cambria Math" w:eastAsiaTheme="minorEastAsia" w:hAnsi="Cambria Math" w:cs="Times New Roman"/>
-                        <w:sz w:val="26"/>
-                        <w:szCs w:val="26"/>
-                      </w:rPr>
-                      <m:t>30000-9722.22</m:t>
-                    </m:r>
-                  </m:e>
-                </m:d>
-                <m:r>
-                  <w:rPr>
-                    <w:rFonts w:ascii="Cambria Math" w:eastAsiaTheme="minorEastAsia" w:hAnsi="Cambria Math" w:cs="Times New Roman"/>
-                    <w:sz w:val="26"/>
-                    <w:szCs w:val="26"/>
-                  </w:rPr>
-                  <m:t>/9158.71</m:t>
-                </m:r>
-              </m:oMath>
-            </m:oMathPara>
+            <w:r>
+              <w:rPr>
+                <w:rFonts w:ascii="Times New Roman" w:eastAsiaTheme="minorEastAsia" w:hAnsi="Times New Roman" w:cs="Times New Roman"/>
+                <w:iCs/>
+                <w:sz w:val="26"/>
+                <w:szCs w:val="26"/>
+                <w:lang w:val="vi-VN"/>
+              </w:rPr>
+              <w:t>(30000-9722.22)/9158.71</w:t>
+            </w:r>
           </w:p>
         </w:tc>
         <w:tc>
@@ -5574,39 +5207,16 @@
                 <w:lang w:val="vi-VN"/>
               </w:rPr>
             </w:pPr>
-            <m:oMathPara>
-              <m:oMath>
-                <m:d>
-                  <m:dPr>
-                    <m:ctrlPr>
-                      <w:rPr>
-                        <w:rFonts w:ascii="Cambria Math" w:eastAsiaTheme="minorEastAsia" w:hAnsi="Cambria Math" w:cs="Times New Roman"/>
-                        <w:sz w:val="26"/>
-                        <w:szCs w:val="26"/>
-                      </w:rPr>
-                    </m:ctrlPr>
-                  </m:dPr>
-                  <m:e>
-                    <m:r>
-                      <w:rPr>
-                        <w:rFonts w:ascii="Cambria Math" w:eastAsiaTheme="minorEastAsia" w:hAnsi="Cambria Math" w:cs="Times New Roman"/>
-                        <w:sz w:val="26"/>
-                        <w:szCs w:val="26"/>
-                      </w:rPr>
-                      <m:t>8200-9722.22</m:t>
-                    </m:r>
-                  </m:e>
-                </m:d>
-                <m:r>
-                  <w:rPr>
-                    <w:rFonts w:ascii="Cambria Math" w:eastAsiaTheme="minorEastAsia" w:hAnsi="Cambria Math" w:cs="Times New Roman"/>
-                    <w:sz w:val="26"/>
-                    <w:szCs w:val="26"/>
-                  </w:rPr>
-                  <m:t>/9158.71</m:t>
-                </m:r>
-              </m:oMath>
-            </m:oMathPara>
+            <w:r>
+              <w:rPr>
+                <w:rFonts w:ascii="Times New Roman" w:eastAsiaTheme="minorEastAsia" w:hAnsi="Times New Roman" w:cs="Times New Roman"/>
+                <w:iCs/>
+                <w:sz w:val="26"/>
+                <w:szCs w:val="26"/>
+                <w:lang w:val="vi-VN"/>
+              </w:rPr>
+              <w:t>(8200-9722.22)/9158.71</w:t>
+            </w:r>
           </w:p>
         </w:tc>
         <w:tc>
@@ -5713,39 +5323,16 @@
                 <w:lang w:val="vi-VN"/>
               </w:rPr>
             </w:pPr>
-            <m:oMathPara>
-              <m:oMath>
-                <m:d>
-                  <m:dPr>
-                    <m:ctrlPr>
-                      <w:rPr>
-                        <w:rFonts w:ascii="Cambria Math" w:eastAsiaTheme="minorEastAsia" w:hAnsi="Cambria Math" w:cs="Times New Roman"/>
-                        <w:sz w:val="26"/>
-                        <w:szCs w:val="26"/>
-                      </w:rPr>
-                    </m:ctrlPr>
-                  </m:dPr>
-                  <m:e>
-                    <m:r>
-                      <w:rPr>
-                        <w:rFonts w:ascii="Cambria Math" w:eastAsiaTheme="minorEastAsia" w:hAnsi="Cambria Math" w:cs="Times New Roman"/>
-                        <w:sz w:val="26"/>
-                        <w:szCs w:val="26"/>
-                      </w:rPr>
-                      <m:t>7800-9722.22</m:t>
-                    </m:r>
-                  </m:e>
-                </m:d>
-                <m:r>
-                  <w:rPr>
-                    <w:rFonts w:ascii="Cambria Math" w:eastAsiaTheme="minorEastAsia" w:hAnsi="Cambria Math" w:cs="Times New Roman"/>
-                    <w:sz w:val="26"/>
-                    <w:szCs w:val="26"/>
-                  </w:rPr>
-                  <m:t>/9158.71</m:t>
-                </m:r>
-              </m:oMath>
-            </m:oMathPara>
+            <w:r>
+              <w:rPr>
+                <w:rFonts w:ascii="Times New Roman" w:eastAsiaTheme="minorEastAsia" w:hAnsi="Times New Roman" w:cs="Times New Roman"/>
+                <w:iCs/>
+                <w:sz w:val="26"/>
+                <w:szCs w:val="26"/>
+                <w:lang w:val="vi-VN"/>
+              </w:rPr>
+              <w:t>(7800-9722.22)/9158.71</w:t>
+            </w:r>
           </w:p>
         </w:tc>
         <w:tc>
@@ -6621,72 +6208,15 @@
         </w:rPr>
         <w:t xml:space="preserve">Mean (Trung bình): </w:t>
       </w:r>
-      <m:oMath>
-        <m:r>
-          <w:rPr>
-            <w:rFonts w:ascii="Cambria Math" w:hAnsi="Cambria Math" w:cs="Times New Roman"/>
-            <w:sz w:val="26"/>
-            <w:szCs w:val="26"/>
-          </w:rPr>
-          <m:t>μ=</m:t>
-        </m:r>
-        <m:f>
-          <m:fPr>
-            <m:ctrlPr>
-              <w:rPr>
-                <w:rFonts w:ascii="Cambria Math" w:hAnsi="Cambria Math" w:cs="Times New Roman"/>
-                <w:sz w:val="26"/>
-                <w:szCs w:val="26"/>
-              </w:rPr>
-            </m:ctrlPr>
-          </m:fPr>
-          <m:num>
-            <m:r>
-              <w:rPr>
-                <w:rFonts w:ascii="Cambria Math" w:hAnsi="Cambria Math" w:cs="Times New Roman"/>
-                <w:sz w:val="26"/>
-                <w:szCs w:val="26"/>
-              </w:rPr>
-              <m:t>809</m:t>
-            </m:r>
-          </m:num>
-          <m:den>
-            <m:r>
-              <w:rPr>
-                <w:rFonts w:ascii="Cambria Math" w:hAnsi="Cambria Math" w:cs="Times New Roman"/>
-                <w:sz w:val="26"/>
-                <w:szCs w:val="26"/>
-              </w:rPr>
-              <m:t>27</m:t>
-            </m:r>
-          </m:den>
-        </m:f>
-        <m:r>
-          <w:rPr>
-            <w:rFonts w:ascii="Cambria Math" w:hAnsi="Cambria Math" w:cs="Times New Roman"/>
-            <w:sz w:val="26"/>
-            <w:szCs w:val="26"/>
-          </w:rPr>
-          <m:t xml:space="preserve"> ~</m:t>
-        </m:r>
-        <m:r>
-          <w:rPr>
-            <w:rFonts w:ascii="Cambria Math" w:hAnsi="Cambria Math" w:cs="Times New Roman"/>
-            <w:sz w:val="26"/>
-            <w:szCs w:val="26"/>
-            <w:lang w:val="vi-VN"/>
-          </w:rPr>
-          <m:t xml:space="preserve">~ </m:t>
-        </m:r>
-        <m:r>
-          <w:rPr>
-            <w:rFonts w:ascii="Cambria Math" w:hAnsi="Cambria Math" w:cs="Times New Roman"/>
-            <w:sz w:val="26"/>
-            <w:szCs w:val="26"/>
-          </w:rPr>
-          <m:t>29.96</m:t>
-        </m:r>
-      </m:oMath>
+      <w:r>
+        <w:rPr>
+          <w:rFonts w:ascii="Times New Roman" w:hAnsi="Times New Roman" w:cs="Times New Roman"/>
+          <w:sz w:val="26"/>
+          <w:szCs w:val="26"/>
+          <w:lang w:val="vi-VN"/>
+        </w:rPr>
+        <w:t>μ</w:t>
+      </w:r>
       <w:r>
         <w:rPr>
           <w:rFonts w:ascii="Times New Roman" w:hAnsi="Times New Roman" w:cs="Times New Roman"/>
@@ -6695,6 +6225,33 @@
           <w:lang w:val="vi-VN"/>
         </w:rPr>
         <w:t xml:space="preserve"> </w:t>
+      </w:r>
+      <w:r>
+        <w:rPr>
+          <w:rFonts w:ascii="Times New Roman" w:hAnsi="Times New Roman" w:cs="Times New Roman"/>
+          <w:sz w:val="26"/>
+          <w:szCs w:val="26"/>
+          <w:lang w:val="vi-VN"/>
+        </w:rPr>
+        <w:t>=</w:t>
+      </w:r>
+      <w:r>
+        <w:rPr>
+          <w:rFonts w:ascii="Times New Roman" w:hAnsi="Times New Roman" w:cs="Times New Roman"/>
+          <w:sz w:val="26"/>
+          <w:szCs w:val="26"/>
+          <w:lang w:val="vi-VN"/>
+        </w:rPr>
+        <w:t xml:space="preserve"> </w:t>
+      </w:r>
+      <w:r>
+        <w:rPr>
+          <w:rFonts w:ascii="Times New Roman" w:hAnsi="Times New Roman" w:cs="Times New Roman"/>
+          <w:sz w:val="26"/>
+          <w:szCs w:val="26"/>
+          <w:lang w:val="vi-VN"/>
+        </w:rPr>
+        <w:t>809/27  ~~ 29.96</w:t>
       </w:r>
     </w:p>
     <w:p>
@@ -6720,67 +6277,80 @@
           <w:szCs w:val="26"/>
           <w:lang w:val="vi-VN"/>
         </w:rPr>
-        <w:t xml:space="preserve">Median (Trung vị): với N = 27, trung vị sẽ nằm ở vị trí thứ </w:t>
-      </w:r>
-      <m:oMath>
-        <m:r>
-          <w:rPr>
-            <w:rFonts w:ascii="Cambria Math" w:hAnsi="Cambria Math" w:cs="Times New Roman"/>
-            <w:sz w:val="26"/>
-            <w:szCs w:val="26"/>
-            <w:lang w:val="vi-VN"/>
-          </w:rPr>
-          <m:t xml:space="preserve"> </m:t>
-        </m:r>
-        <m:f>
-          <m:fPr>
-            <m:ctrlPr>
-              <w:rPr>
-                <w:rFonts w:ascii="Cambria Math" w:hAnsi="Cambria Math" w:cs="Times New Roman"/>
-                <w:sz w:val="26"/>
-                <w:szCs w:val="26"/>
-              </w:rPr>
-            </m:ctrlPr>
-          </m:fPr>
-          <m:num>
-            <m:r>
-              <w:rPr>
-                <w:rFonts w:ascii="Cambria Math" w:hAnsi="Cambria Math" w:cs="Times New Roman"/>
-                <w:sz w:val="26"/>
-                <w:szCs w:val="26"/>
-              </w:rPr>
-              <m:t>27+1</m:t>
-            </m:r>
-          </m:num>
-          <m:den>
-            <m:r>
-              <w:rPr>
-                <w:rFonts w:ascii="Cambria Math" w:hAnsi="Cambria Math" w:cs="Times New Roman"/>
-                <w:sz w:val="26"/>
-                <w:szCs w:val="26"/>
-              </w:rPr>
-              <m:t>2</m:t>
-            </m:r>
-          </m:den>
-        </m:f>
-        <m:r>
-          <w:rPr>
-            <w:rFonts w:ascii="Cambria Math" w:hAnsi="Cambria Math" w:cs="Times New Roman"/>
-            <w:sz w:val="26"/>
-            <w:szCs w:val="26"/>
-          </w:rPr>
-          <m:t>=14.</m:t>
-        </m:r>
-        <m:r>
-          <w:rPr>
-            <w:rFonts w:ascii="Cambria Math" w:hAnsi="Cambria Math" w:cs="Times New Roman"/>
-            <w:sz w:val="26"/>
-            <w:szCs w:val="26"/>
-            <w:lang w:val="vi-VN"/>
-          </w:rPr>
-          <m:t xml:space="preserve"> </m:t>
-        </m:r>
-      </m:oMath>
+        <w:t>Median (Trung vị): với N = 27, trung vị sẽ nằm ở vị trí thứ</w:t>
+      </w:r>
+      <w:r>
+        <w:rPr>
+          <w:rFonts w:ascii="Times New Roman" w:hAnsi="Times New Roman" w:cs="Times New Roman"/>
+          <w:sz w:val="26"/>
+          <w:szCs w:val="26"/>
+          <w:lang w:val="vi-VN"/>
+        </w:rPr>
+        <w:t xml:space="preserve"> </w:t>
+      </w:r>
+      <w:r>
+        <w:rPr>
+          <w:rFonts w:ascii="Times New Roman" w:hAnsi="Times New Roman" w:cs="Times New Roman"/>
+          <w:sz w:val="26"/>
+          <w:szCs w:val="26"/>
+          <w:lang w:val="vi-VN"/>
+        </w:rPr>
+        <w:t>(27+1)</w:t>
+      </w:r>
+      <w:r>
+        <w:rPr>
+          <w:rFonts w:ascii="Times New Roman" w:hAnsi="Times New Roman" w:cs="Times New Roman"/>
+          <w:sz w:val="26"/>
+          <w:szCs w:val="26"/>
+          <w:lang w:val="vi-VN"/>
+        </w:rPr>
+        <w:t xml:space="preserve"> </w:t>
+      </w:r>
+      <w:r>
+        <w:rPr>
+          <w:rFonts w:ascii="Times New Roman" w:hAnsi="Times New Roman" w:cs="Times New Roman"/>
+          <w:sz w:val="26"/>
+          <w:szCs w:val="26"/>
+          <w:lang w:val="vi-VN"/>
+        </w:rPr>
+        <w:t>/</w:t>
+      </w:r>
+      <w:r>
+        <w:rPr>
+          <w:rFonts w:ascii="Times New Roman" w:hAnsi="Times New Roman" w:cs="Times New Roman"/>
+          <w:sz w:val="26"/>
+          <w:szCs w:val="26"/>
+          <w:lang w:val="vi-VN"/>
+        </w:rPr>
+        <w:t xml:space="preserve"> </w:t>
+      </w:r>
+      <w:r>
+        <w:rPr>
+          <w:rFonts w:ascii="Times New Roman" w:hAnsi="Times New Roman" w:cs="Times New Roman"/>
+          <w:sz w:val="26"/>
+          <w:szCs w:val="26"/>
+          <w:lang w:val="vi-VN"/>
+        </w:rPr>
+        <w:t xml:space="preserve">2=14. </w:t>
+      </w:r>
+      <w:r>
+        <w:rPr>
+          <w:rFonts w:ascii="Times New Roman" w:hAnsi="Times New Roman" w:cs="Times New Roman"/>
+          <w:sz w:val="26"/>
+          <w:szCs w:val="26"/>
+          <w:lang w:val="vi-VN"/>
+        </w:rPr>
+        <w:t xml:space="preserve"> </w:t>
+      </w:r>
+      <w:r>
+        <w:rPr>
+          <w:rFonts w:ascii="Times New Roman" w:hAnsi="Times New Roman" w:cs="Times New Roman"/>
+          <w:sz w:val="26"/>
+          <w:szCs w:val="26"/>
+          <w:lang w:val="vi-VN"/>
+        </w:rPr>
+        <w:t>.</w:t>
+      </w:r>
       <w:r>
         <w:rPr>
           <w:rFonts w:ascii="Times New Roman" w:eastAsiaTheme="minorEastAsia" w:hAnsi="Times New Roman" w:cs="Times New Roman"/>
@@ -6836,7 +6406,6 @@
           <w:color w:val="auto"/>
           <w:lang w:val="vi-VN"/>
         </w:rPr>
-        <w:lastRenderedPageBreak/>
         <w:t>Xác định tứ phân vị thứ nhất (Q1) và tứ phân vị thứ ba (Q3) (xấp xỉ nếu cần).</w:t>
       </w:r>
     </w:p>
@@ -6864,63 +6433,32 @@
         </w:rPr>
         <w:t xml:space="preserve">Q1 : vị trí của </w:t>
       </w:r>
-      <m:oMath>
-        <m:r>
-          <w:rPr>
-            <w:rFonts w:ascii="Cambria Math" w:hAnsi="Cambria Math" w:cs="Times New Roman"/>
-            <w:sz w:val="26"/>
-            <w:szCs w:val="26"/>
-          </w:rPr>
-          <m:t>Q1=</m:t>
-        </m:r>
-        <m:f>
-          <m:fPr>
-            <m:ctrlPr>
-              <w:rPr>
-                <w:rFonts w:ascii="Cambria Math" w:hAnsi="Cambria Math" w:cs="Times New Roman"/>
-                <w:sz w:val="26"/>
-                <w:szCs w:val="26"/>
-              </w:rPr>
-            </m:ctrlPr>
-          </m:fPr>
-          <m:num>
-            <m:r>
-              <w:rPr>
-                <w:rFonts w:ascii="Cambria Math" w:hAnsi="Cambria Math" w:cs="Times New Roman"/>
-                <w:sz w:val="26"/>
-                <w:szCs w:val="26"/>
-              </w:rPr>
-              <m:t>27+1</m:t>
-            </m:r>
-          </m:num>
-          <m:den>
-            <m:r>
-              <w:rPr>
-                <w:rFonts w:ascii="Cambria Math" w:hAnsi="Cambria Math" w:cs="Times New Roman"/>
-                <w:sz w:val="26"/>
-                <w:szCs w:val="26"/>
-              </w:rPr>
-              <m:t>4</m:t>
-            </m:r>
-          </m:den>
-        </m:f>
-        <m:r>
-          <w:rPr>
-            <w:rFonts w:ascii="Cambria Math" w:hAnsi="Cambria Math" w:cs="Times New Roman"/>
-            <w:sz w:val="26"/>
-            <w:szCs w:val="26"/>
-          </w:rPr>
-          <m:t>=7.</m:t>
-        </m:r>
-      </m:oMath>
-      <w:r>
-        <w:rPr>
-          <w:rFonts w:ascii="Times New Roman" w:eastAsiaTheme="minorEastAsia" w:hAnsi="Times New Roman" w:cs="Times New Roman"/>
-          <w:sz w:val="26"/>
-          <w:szCs w:val="26"/>
-          <w:lang w:val="vi-VN"/>
-        </w:rPr>
-        <w:t xml:space="preserve"> Giá trị ở vị trí số 7 là 20.</w:t>
+      <w:r>
+        <w:rPr>
+          <w:rFonts w:ascii="Times New Roman" w:hAnsi="Times New Roman" w:cs="Times New Roman"/>
+          <w:sz w:val="26"/>
+          <w:szCs w:val="26"/>
+          <w:lang w:val="vi-VN"/>
+        </w:rPr>
+        <w:t>Q1=(27+1)/4=7.</w:t>
+      </w:r>
+      <w:r>
+        <w:rPr>
+          <w:rFonts w:ascii="Times New Roman" w:hAnsi="Times New Roman" w:cs="Times New Roman"/>
+          <w:sz w:val="26"/>
+          <w:szCs w:val="26"/>
+          <w:lang w:val="vi-VN"/>
+        </w:rPr>
+        <w:t xml:space="preserve"> </w:t>
+      </w:r>
+      <w:r>
+        <w:rPr>
+          <w:rFonts w:ascii="Times New Roman" w:eastAsiaTheme="minorEastAsia" w:hAnsi="Times New Roman" w:cs="Times New Roman"/>
+          <w:sz w:val="26"/>
+          <w:szCs w:val="26"/>
+          <w:lang w:val="vi-VN"/>
+        </w:rPr>
+        <w:t>Giá trị ở vị trí số 7 là 20.</w:t>
       </w:r>
     </w:p>
     <w:p>
@@ -6943,62 +6481,20 @@
         </w:rPr>
         <w:t xml:space="preserve">Q3: Vị trí của </w:t>
       </w:r>
-      <m:oMath>
-        <m:r>
-          <w:rPr>
-            <w:rFonts w:ascii="Cambria Math" w:hAnsi="Cambria Math" w:cs="Times New Roman"/>
-          </w:rPr>
-          <m:t>Q3=</m:t>
-        </m:r>
-        <m:f>
-          <m:fPr>
-            <m:ctrlPr>
-              <w:rPr>
-                <w:rFonts w:ascii="Cambria Math" w:hAnsi="Cambria Math" w:cs="Times New Roman"/>
-              </w:rPr>
-            </m:ctrlPr>
-          </m:fPr>
-          <m:num>
-            <m:r>
-              <w:rPr>
-                <w:rFonts w:ascii="Cambria Math" w:hAnsi="Cambria Math" w:cs="Times New Roman"/>
-              </w:rPr>
-              <m:t>3</m:t>
-            </m:r>
-            <m:d>
-              <m:dPr>
-                <m:ctrlPr>
-                  <w:rPr>
-                    <w:rFonts w:ascii="Cambria Math" w:hAnsi="Cambria Math" w:cs="Times New Roman"/>
-                  </w:rPr>
-                </m:ctrlPr>
-              </m:dPr>
-              <m:e>
-                <m:r>
-                  <w:rPr>
-                    <w:rFonts w:ascii="Cambria Math" w:hAnsi="Cambria Math" w:cs="Times New Roman"/>
-                  </w:rPr>
-                  <m:t>27+1</m:t>
-                </m:r>
-              </m:e>
-            </m:d>
-          </m:num>
-          <m:den>
-            <m:r>
-              <w:rPr>
-                <w:rFonts w:ascii="Cambria Math" w:hAnsi="Cambria Math" w:cs="Times New Roman"/>
-              </w:rPr>
-              <m:t>4</m:t>
-            </m:r>
-          </m:den>
-        </m:f>
-        <m:r>
-          <w:rPr>
-            <w:rFonts w:ascii="Cambria Math" w:hAnsi="Cambria Math" w:cs="Times New Roman"/>
-          </w:rPr>
-          <m:t>=21.</m:t>
-        </m:r>
-      </m:oMath>
+      <w:r>
+        <w:rPr>
+          <w:rFonts w:ascii="Times New Roman" w:hAnsi="Times New Roman" w:cs="Times New Roman"/>
+          <w:lang w:val="vi-VN"/>
+        </w:rPr>
+        <w:t>Q</w:t>
+      </w:r>
+      <w:r>
+        <w:rPr>
+          <w:rFonts w:ascii="Times New Roman" w:hAnsi="Times New Roman" w:cs="Times New Roman"/>
+          <w:lang w:val="vi-VN"/>
+        </w:rPr>
+        <w:t>3=3(27+1)/4=21.</w:t>
+      </w:r>
       <w:r>
         <w:rPr>
           <w:rFonts w:ascii="Times New Roman" w:eastAsiaTheme="minorEastAsia" w:hAnsi="Times New Roman" w:cs="Times New Roman"/>
@@ -7027,6 +6523,7 @@
           <w:color w:val="auto"/>
           <w:lang w:val="vi-VN"/>
         </w:rPr>
+        <w:lastRenderedPageBreak/>
         <w:t>Vẽ biểu đồ hộp (boxplot) cho tập dữ liệu trên và nhận xét về phân bố dữ liệu.</w:t>
       </w:r>
     </w:p>
@@ -7350,31 +6847,15 @@
         </w:rPr>
         <w:t xml:space="preserve">+ Bin 1 [13; 27.25): Gồm 14 mẫu </w:t>
       </w:r>
-      <m:oMath>
-        <m:d>
-          <m:dPr>
-            <m:begChr m:val="{"/>
-            <m:endChr m:val="}"/>
-            <m:ctrlPr>
-              <w:rPr>
-                <w:rFonts w:ascii="Cambria Math" w:hAnsi="Cambria Math" w:cs="Times New Roman"/>
-                <w:sz w:val="26"/>
-                <w:szCs w:val="26"/>
-              </w:rPr>
-            </m:ctrlPr>
-          </m:dPr>
-          <m:e>
-            <m:r>
-              <w:rPr>
-                <w:rFonts w:ascii="Cambria Math" w:hAnsi="Cambria Math" w:cs="Times New Roman"/>
-                <w:sz w:val="26"/>
-                <w:szCs w:val="26"/>
-              </w:rPr>
-              <m:t>13,15,16,16,19,20,20,21,22,22,25,25,25,25</m:t>
-            </m:r>
-          </m:e>
-        </m:d>
-      </m:oMath>
+      <w:r>
+        <w:rPr>
+          <w:rFonts w:ascii="Times New Roman" w:hAnsi="Times New Roman" w:cs="Times New Roman"/>
+          <w:sz w:val="26"/>
+          <w:szCs w:val="26"/>
+          <w:lang w:val="vi-VN"/>
+        </w:rPr>
+        <w:t>{13,15,16,16,19,20,20,21,22,22,25,25,25,25}</w:t>
+      </w:r>
     </w:p>
     <w:p>
       <w:pPr>
@@ -7393,102 +6874,78 @@
           <w:szCs w:val="26"/>
           <w:lang w:val="vi-VN"/>
         </w:rPr>
+        <w:t xml:space="preserve">+ Bin 2 [27.25; 41.5): Gồm 9 mẫu </w:t>
+      </w:r>
+      <w:r>
+        <w:rPr>
+          <w:rFonts w:ascii="Times New Roman" w:hAnsi="Times New Roman" w:cs="Times New Roman"/>
+          <w:sz w:val="26"/>
+          <w:szCs w:val="26"/>
+          <w:lang w:val="vi-VN"/>
+        </w:rPr>
+        <w:t>{30,33,33,35,35,35,35,36,40}.</w:t>
+      </w:r>
+    </w:p>
+    <w:p>
+      <w:pPr>
+        <w:pStyle w:val="ListParagraph"/>
+        <w:jc w:val="both"/>
+        <w:rPr>
+          <w:rFonts w:ascii="Times New Roman" w:hAnsi="Times New Roman" w:cs="Times New Roman"/>
+          <w:sz w:val="26"/>
+          <w:szCs w:val="26"/>
+          <w:lang w:val="vi-VN"/>
+        </w:rPr>
+      </w:pPr>
+      <w:r>
+        <w:rPr>
+          <w:rFonts w:ascii="Times New Roman" w:hAnsi="Times New Roman" w:cs="Times New Roman"/>
+          <w:sz w:val="26"/>
+          <w:szCs w:val="26"/>
+          <w:lang w:val="vi-VN"/>
+        </w:rPr>
+        <w:t>+ Bin 3 [41.5; 55.75): Gồm 3 mẫu {45,46,52}.</w:t>
+      </w:r>
+    </w:p>
+    <w:p>
+      <w:pPr>
+        <w:pStyle w:val="ListParagraph"/>
+        <w:jc w:val="both"/>
+        <w:rPr>
+          <w:rFonts w:ascii="Times New Roman" w:hAnsi="Times New Roman" w:cs="Times New Roman"/>
+          <w:sz w:val="26"/>
+          <w:szCs w:val="26"/>
+          <w:lang w:val="vi-VN"/>
+        </w:rPr>
+      </w:pPr>
+      <w:r>
+        <w:rPr>
+          <w:rFonts w:ascii="Times New Roman" w:hAnsi="Times New Roman" w:cs="Times New Roman"/>
+          <w:sz w:val="26"/>
+          <w:szCs w:val="26"/>
+          <w:lang w:val="vi-VN"/>
+        </w:rPr>
+        <w:t>+ Bin 4 [55.75; 70]: Gồm 1 mẫu {70}.</w:t>
+      </w:r>
+    </w:p>
+    <w:p>
+      <w:pPr>
+        <w:jc w:val="both"/>
+        <w:rPr>
+          <w:rFonts w:ascii="Times New Roman" w:hAnsi="Times New Roman" w:cs="Times New Roman"/>
+          <w:sz w:val="26"/>
+          <w:szCs w:val="26"/>
+          <w:lang w:val="vi-VN"/>
+        </w:rPr>
+      </w:pPr>
+      <w:r>
+        <w:rPr>
+          <w:rFonts w:ascii="Times New Roman" w:hAnsi="Times New Roman" w:cs="Times New Roman"/>
+          <w:sz w:val="26"/>
+          <w:szCs w:val="26"/>
+          <w:lang w:val="vi-VN"/>
+        </w:rPr>
         <w:lastRenderedPageBreak/>
-        <w:t xml:space="preserve">+ Bin 2 [27.25; 41.5): Gồm 9 mẫu </w:t>
-      </w:r>
-      <m:oMath>
-        <m:d>
-          <m:dPr>
-            <m:begChr m:val="{"/>
-            <m:endChr m:val="}"/>
-            <m:ctrlPr>
-              <w:rPr>
-                <w:rFonts w:ascii="Cambria Math" w:hAnsi="Cambria Math" w:cs="Times New Roman"/>
-                <w:sz w:val="26"/>
-                <w:szCs w:val="26"/>
-              </w:rPr>
-            </m:ctrlPr>
-          </m:dPr>
-          <m:e>
-            <m:r>
-              <w:rPr>
-                <w:rFonts w:ascii="Cambria Math" w:hAnsi="Cambria Math" w:cs="Times New Roman"/>
-                <w:sz w:val="26"/>
-                <w:szCs w:val="26"/>
-              </w:rPr>
-              <m:t>30,33,33,35,35,35,35,36,40</m:t>
-            </m:r>
-          </m:e>
-        </m:d>
-      </m:oMath>
-      <w:r>
-        <w:rPr>
-          <w:rFonts w:ascii="Times New Roman" w:hAnsi="Times New Roman" w:cs="Times New Roman"/>
-          <w:sz w:val="26"/>
-          <w:szCs w:val="26"/>
-        </w:rPr>
-        <w:t>.</w:t>
-      </w:r>
-    </w:p>
-    <w:p>
-      <w:pPr>
-        <w:pStyle w:val="ListParagraph"/>
-        <w:jc w:val="both"/>
-        <w:rPr>
-          <w:rFonts w:ascii="Times New Roman" w:hAnsi="Times New Roman" w:cs="Times New Roman"/>
-          <w:sz w:val="26"/>
-          <w:szCs w:val="26"/>
-          <w:lang w:val="vi-VN"/>
-        </w:rPr>
-      </w:pPr>
-      <w:r>
-        <w:rPr>
-          <w:rFonts w:ascii="Times New Roman" w:hAnsi="Times New Roman" w:cs="Times New Roman"/>
-          <w:sz w:val="26"/>
-          <w:szCs w:val="26"/>
-          <w:lang w:val="vi-VN"/>
-        </w:rPr>
-        <w:t>+ Bin 3 [41.5; 55.75): Gồm 3 mẫu {45,46,52}.</w:t>
-      </w:r>
-    </w:p>
-    <w:p>
-      <w:pPr>
-        <w:pStyle w:val="ListParagraph"/>
-        <w:jc w:val="both"/>
-        <w:rPr>
-          <w:rFonts w:ascii="Times New Roman" w:hAnsi="Times New Roman" w:cs="Times New Roman"/>
-          <w:sz w:val="26"/>
-          <w:szCs w:val="26"/>
-          <w:lang w:val="vi-VN"/>
-        </w:rPr>
-      </w:pPr>
-      <w:r>
-        <w:rPr>
-          <w:rFonts w:ascii="Times New Roman" w:hAnsi="Times New Roman" w:cs="Times New Roman"/>
-          <w:sz w:val="26"/>
-          <w:szCs w:val="26"/>
-          <w:lang w:val="vi-VN"/>
-        </w:rPr>
-        <w:t>+ Bin 4 [55.75; 70]: Gồm 1 mẫu {70}.</w:t>
-      </w:r>
-    </w:p>
-    <w:p>
-      <w:pPr>
-        <w:jc w:val="both"/>
-        <w:rPr>
-          <w:rFonts w:ascii="Times New Roman" w:hAnsi="Times New Roman" w:cs="Times New Roman"/>
-          <w:sz w:val="26"/>
-          <w:szCs w:val="26"/>
-          <w:lang w:val="vi-VN"/>
-        </w:rPr>
-      </w:pPr>
-      <w:r>
-        <w:rPr>
-          <w:rFonts w:ascii="Times New Roman" w:hAnsi="Times New Roman" w:cs="Times New Roman"/>
-          <w:sz w:val="26"/>
-          <w:szCs w:val="26"/>
-          <w:lang w:val="vi-VN"/>
-        </w:rPr>
         <w:t>Phương pháp chia tần số đều:</w:t>
       </w:r>
       <w:r>
@@ -7525,47 +6982,15 @@
         </w:rPr>
         <w:t xml:space="preserve">Tính số lượng mẫu mỗi Bin: Tổng N = 27 mẫu, chia k = 4. Ta có </w:t>
       </w:r>
-      <m:oMath>
-        <m:f>
-          <m:fPr>
-            <m:ctrlPr>
-              <w:rPr>
-                <w:rFonts w:ascii="Cambria Math" w:hAnsi="Cambria Math" w:cs="Times New Roman"/>
-                <w:sz w:val="26"/>
-                <w:szCs w:val="26"/>
-              </w:rPr>
-            </m:ctrlPr>
-          </m:fPr>
-          <m:num>
-            <m:r>
-              <w:rPr>
-                <w:rFonts w:ascii="Cambria Math" w:hAnsi="Cambria Math" w:cs="Times New Roman"/>
-                <w:sz w:val="26"/>
-                <w:szCs w:val="26"/>
-              </w:rPr>
-              <m:t>27</m:t>
-            </m:r>
-          </m:num>
-          <m:den>
-            <m:r>
-              <w:rPr>
-                <w:rFonts w:ascii="Cambria Math" w:hAnsi="Cambria Math" w:cs="Times New Roman"/>
-                <w:sz w:val="26"/>
-                <w:szCs w:val="26"/>
-              </w:rPr>
-              <m:t>4</m:t>
-            </m:r>
-          </m:den>
-        </m:f>
-        <m:r>
-          <w:rPr>
-            <w:rFonts w:ascii="Cambria Math" w:hAnsi="Cambria Math" w:cs="Times New Roman"/>
-            <w:sz w:val="26"/>
-            <w:szCs w:val="26"/>
-          </w:rPr>
-          <m:t>=6.75.</m:t>
-        </m:r>
-      </m:oMath>
+      <w:r>
+        <w:rPr>
+          <w:rFonts w:ascii="Times New Roman" w:hAnsi="Times New Roman" w:cs="Times New Roman"/>
+          <w:sz w:val="26"/>
+          <w:szCs w:val="26"/>
+          <w:lang w:val="vi-VN"/>
+        </w:rPr>
+        <w:t>27/4=6.75.</w:t>
+      </w:r>
     </w:p>
     <w:p>
       <w:pPr>
@@ -7831,7 +7256,6 @@
           <w:szCs w:val="26"/>
           <w:lang w:val="vi-VN"/>
         </w:rPr>
-        <w:lastRenderedPageBreak/>
         <w:t>W1(.) là thang đo tỷ lệ</w:t>
       </w:r>
       <w:r>
@@ -7909,6 +7333,7 @@
           <w:szCs w:val="26"/>
           <w:lang w:val="vi-VN"/>
         </w:rPr>
+        <w:lastRenderedPageBreak/>
         <w:t xml:space="preserve">W3(.) là thang đo định danh (Nominal) vì các giá trị {8, 13, 45, 6, 7} là các giá trị </w:t>
       </w:r>
       <w:r>
@@ -9627,6 +9052,16 @@
     <w:link w:val="Footer"/>
     <w:uiPriority w:val="99"/>
     <w:rsid w:val="0019523D"/>
+  </w:style>
+  <w:style w:type="character" w:styleId="PlaceholderText">
+    <w:name w:val="Placeholder Text"/>
+    <w:basedOn w:val="DefaultParagraphFont"/>
+    <w:uiPriority w:val="99"/>
+    <w:semiHidden/>
+    <w:rsid w:val="00BA56B2"/>
+    <w:rPr>
+      <w:color w:val="666666"/>
+    </w:rPr>
   </w:style>
 </w:styles>
 </file>

</xml_diff>